<commit_message>
HE-template: Fix small run-related bug
</commit_message>
<xml_diff>
--- a/src/main/resources/org/damap/base/template/horizonEuropeTemplate.docx
+++ b/src/main/resources/org/damap/base/template/horizonEuropeTemplate.docx
@@ -17,29 +17,7 @@
           <w:sz w:val="72"/>
           <w:szCs w:val="72"/>
         </w:rPr>
-        <w:t>[</w:t>
-      </w:r>
-      <w:proofErr w:type="spellStart"/>
-      <w:r>
-        <w:rPr>
-          <w:b/>
-          <w:bCs/>
-          <w:color w:val="000000" w:themeColor="text1"/>
-          <w:sz w:val="72"/>
-          <w:szCs w:val="72"/>
-        </w:rPr>
-        <w:t>projectname</w:t>
-      </w:r>
-      <w:proofErr w:type="spellEnd"/>
-      <w:r>
-        <w:rPr>
-          <w:b/>
-          <w:bCs/>
-          <w:color w:val="000000" w:themeColor="text1"/>
-          <w:sz w:val="72"/>
-          <w:szCs w:val="72"/>
-        </w:rPr>
-        <w:t>]</w:t>
+        <w:t>[projectname]</w:t>
       </w:r>
     </w:p>
     <w:p>
@@ -455,24 +433,15 @@
                 <w:rFonts w:eastAsia="Arial"/>
                 <w:color w:val="000000" w:themeColor="text1"/>
               </w:rPr>
-              <w:t>he [</w:t>
-            </w:r>
-            <w:proofErr w:type="spellStart"/>
+              <w:t>he [projectname</w:t>
+            </w:r>
             <w:r>
               <w:rPr>
                 <w:rFonts w:eastAsia="Arial"/>
                 <w:color w:val="000000" w:themeColor="text1"/>
               </w:rPr>
-              <w:t>projectname</w:t>
-            </w:r>
-            <w:r>
-              <w:rPr>
-                <w:rFonts w:eastAsia="Arial"/>
-                <w:color w:val="000000" w:themeColor="text1"/>
-              </w:rPr>
               <w:t>Text</w:t>
             </w:r>
-            <w:proofErr w:type="spellEnd"/>
             <w:r>
               <w:rPr>
                 <w:rFonts w:eastAsia="Arial"/>
@@ -594,22 +563,14 @@
         <w:rPr>
           <w:color w:val="000000" w:themeColor="text1"/>
         </w:rPr>
-        <w:t>This work by parties of the [</w:t>
-      </w:r>
-      <w:proofErr w:type="spellStart"/>
+        <w:t>This work by parties of the [projectname</w:t>
+      </w:r>
       <w:r>
         <w:rPr>
           <w:color w:val="000000" w:themeColor="text1"/>
         </w:rPr>
-        <w:t>projectname</w:t>
-      </w:r>
-      <w:r>
-        <w:rPr>
-          <w:color w:val="000000" w:themeColor="text1"/>
-        </w:rPr>
         <w:t>Text</w:t>
       </w:r>
-      <w:proofErr w:type="spellEnd"/>
       <w:r>
         <w:rPr>
           <w:color w:val="000000" w:themeColor="text1"/>
@@ -630,56 +591,26 @@
         <w:rPr>
           <w:color w:val="000000" w:themeColor="text1"/>
         </w:rPr>
-        <w:t>). The [</w:t>
-      </w:r>
-      <w:proofErr w:type="spellStart"/>
+        <w:t>). The [projectname</w:t>
+      </w:r>
       <w:r>
         <w:rPr>
           <w:color w:val="000000" w:themeColor="text1"/>
         </w:rPr>
-        <w:t>projectname</w:t>
+        <w:t>Text</w:t>
       </w:r>
       <w:r>
         <w:rPr>
           <w:color w:val="000000" w:themeColor="text1"/>
         </w:rPr>
-        <w:t>Text</w:t>
-      </w:r>
-      <w:proofErr w:type="spellEnd"/>
+        <w:t>] project is funded by the European Union Horizon Europe programme under Grant Agreement No [grant</w:t>
+      </w:r>
       <w:r>
         <w:rPr>
           <w:color w:val="000000" w:themeColor="text1"/>
         </w:rPr>
-        <w:t xml:space="preserve">] project is funded by the European Union Horizon Europe </w:t>
-      </w:r>
-      <w:proofErr w:type="spellStart"/>
-      <w:r>
-        <w:rPr>
-          <w:color w:val="000000" w:themeColor="text1"/>
-        </w:rPr>
-        <w:t>programme</w:t>
-      </w:r>
-      <w:proofErr w:type="spellEnd"/>
-      <w:r>
-        <w:rPr>
-          <w:color w:val="000000" w:themeColor="text1"/>
-        </w:rPr>
-        <w:t xml:space="preserve"> under Grant Agreement No [</w:t>
-      </w:r>
-      <w:proofErr w:type="spellStart"/>
-      <w:r>
-        <w:rPr>
-          <w:color w:val="000000" w:themeColor="text1"/>
-        </w:rPr>
-        <w:t>grant</w:t>
-      </w:r>
-      <w:r>
-        <w:rPr>
-          <w:color w:val="000000" w:themeColor="text1"/>
-        </w:rPr>
         <w:t>id</w:t>
       </w:r>
-      <w:proofErr w:type="spellEnd"/>
       <w:r>
         <w:rPr>
           <w:color w:val="000000" w:themeColor="text1"/>
@@ -1513,25 +1444,7 @@
                 <w:sz w:val="20"/>
                 <w:szCs w:val="20"/>
               </w:rPr>
-              <w:t>[</w:t>
-            </w:r>
-            <w:proofErr w:type="spellStart"/>
-            <w:r>
-              <w:rPr>
-                <w:color w:val="92D050"/>
-                <w:sz w:val="20"/>
-                <w:szCs w:val="20"/>
-              </w:rPr>
-              <w:t>dd.mm.yyyy</w:t>
-            </w:r>
-            <w:proofErr w:type="spellEnd"/>
-            <w:r>
-              <w:rPr>
-                <w:color w:val="92D050"/>
-                <w:sz w:val="20"/>
-                <w:szCs w:val="20"/>
-              </w:rPr>
-              <w:t>]</w:t>
+              <w:t>[dd.mm.yyyy]</w:t>
             </w:r>
           </w:p>
         </w:tc>
@@ -4665,49 +4578,8 @@
       </w:r>
     </w:p>
     <w:p>
-      <w:pPr>
-        <w:rPr>
-          <w:color w:val="404040"/>
-        </w:rPr>
-      </w:pPr>
-      <w:r>
-        <w:rPr>
-          <w:bCs/>
-          <w:color w:val="404040"/>
-        </w:rPr>
-        <w:t>[</w:t>
-      </w:r>
-      <w:proofErr w:type="spellStart"/>
-      <w:r>
-        <w:rPr>
-          <w:bCs/>
-          <w:color w:val="404040"/>
-        </w:rPr>
-        <w:t>datamanager</w:t>
-      </w:r>
-      <w:proofErr w:type="spellEnd"/>
-      <w:r>
-        <w:rPr>
-          <w:bCs/>
-          <w:color w:val="404040"/>
-        </w:rPr>
-        <w:t>] [</w:t>
-      </w:r>
-      <w:proofErr w:type="spellStart"/>
-      <w:r>
-        <w:rPr>
-          <w:bCs/>
-          <w:color w:val="404040"/>
-        </w:rPr>
-        <w:t>datamanagerInfo</w:t>
-      </w:r>
-      <w:proofErr w:type="spellEnd"/>
-      <w:r>
-        <w:rPr>
-          <w:bCs/>
-          <w:color w:val="404040"/>
-        </w:rPr>
-        <w:t>]</w:t>
+      <w:r>
+        <w:t>[datamanager] [datamanagerInfo]</w:t>
       </w:r>
     </w:p>
     <w:p>
@@ -5194,25 +5066,7 @@
                 <w:sz w:val="18"/>
                 <w:szCs w:val="18"/>
               </w:rPr>
-              <w:t>[</w:t>
-            </w:r>
-            <w:proofErr w:type="spellStart"/>
-            <w:r>
-              <w:rPr>
-                <w:color w:val="auto"/>
-                <w:sz w:val="18"/>
-                <w:szCs w:val="18"/>
-              </w:rPr>
-              <w:t>datasetTable</w:t>
-            </w:r>
-            <w:proofErr w:type="spellEnd"/>
-            <w:r>
-              <w:rPr>
-                <w:color w:val="auto"/>
-                <w:sz w:val="18"/>
-                <w:szCs w:val="18"/>
-              </w:rPr>
-              <w:t>]</w:t>
+              <w:t>[datasetTable]</w:t>
             </w:r>
           </w:p>
         </w:tc>
@@ -5491,21 +5345,7 @@
         <w:rPr>
           <w:color w:val="auto"/>
         </w:rPr>
-        <w:t>[</w:t>
-      </w:r>
-      <w:proofErr w:type="spellStart"/>
-      <w:r>
-        <w:rPr>
-          <w:color w:val="auto"/>
-        </w:rPr>
-        <w:t>produceddatadescription</w:t>
-      </w:r>
-      <w:proofErr w:type="spellEnd"/>
-      <w:r>
-        <w:rPr>
-          <w:color w:val="auto"/>
-        </w:rPr>
-        <w:t>]</w:t>
+        <w:t>[produceddatadescription]</w:t>
       </w:r>
     </w:p>
     <w:p>
@@ -5756,25 +5596,7 @@
                 <w:sz w:val="18"/>
                 <w:szCs w:val="18"/>
               </w:rPr>
-              <w:t>[</w:t>
-            </w:r>
-            <w:proofErr w:type="spellStart"/>
-            <w:r>
-              <w:rPr>
-                <w:color w:val="auto"/>
-                <w:sz w:val="18"/>
-                <w:szCs w:val="18"/>
-              </w:rPr>
-              <w:t>reusedDatasetTable</w:t>
-            </w:r>
-            <w:proofErr w:type="spellEnd"/>
-            <w:r>
-              <w:rPr>
-                <w:color w:val="auto"/>
-                <w:sz w:val="18"/>
-                <w:szCs w:val="18"/>
-              </w:rPr>
-              <w:t>]</w:t>
+              <w:t>[reusedDatasetTable]</w:t>
             </w:r>
           </w:p>
         </w:tc>
@@ -5980,15 +5802,7 @@
     <w:p>
       <w:bookmarkStart w:id="12" w:name="_Toc156287341"/>
       <w:r>
-        <w:t>[</w:t>
-      </w:r>
-      <w:proofErr w:type="spellStart"/>
-      <w:r>
-        <w:t>reuseddatadescription</w:t>
-      </w:r>
-      <w:proofErr w:type="spellEnd"/>
-      <w:r>
-        <w:t>]</w:t>
+        <w:t>[reuseddatadescription]</w:t>
       </w:r>
     </w:p>
     <w:p>
@@ -6013,23 +5827,7 @@
           <w:rFonts w:eastAsiaTheme="minorEastAsia"/>
           <w:color w:val="auto"/>
         </w:rPr>
-        <w:t>[</w:t>
-      </w:r>
-      <w:proofErr w:type="spellStart"/>
-      <w:r>
-        <w:rPr>
-          <w:rFonts w:eastAsiaTheme="minorEastAsia"/>
-          <w:color w:val="auto"/>
-        </w:rPr>
-        <w:t>datageneration</w:t>
-      </w:r>
-      <w:proofErr w:type="spellEnd"/>
-      <w:r>
-        <w:rPr>
-          <w:rFonts w:eastAsiaTheme="minorEastAsia"/>
-          <w:color w:val="auto"/>
-        </w:rPr>
-        <w:t>]</w:t>
+        <w:t>[datageneration]</w:t>
       </w:r>
     </w:p>
     <w:p>
@@ -6050,15 +5848,7 @@
         </w:rPr>
       </w:pPr>
       <w:r>
-        <w:t>[</w:t>
-      </w:r>
-      <w:proofErr w:type="spellStart"/>
-      <w:r>
-        <w:t>targetaudience</w:t>
-      </w:r>
-      <w:proofErr w:type="spellEnd"/>
-      <w:r>
-        <w:t>]</w:t>
+        <w:t>[targetaudience]</w:t>
       </w:r>
     </w:p>
     <w:p>
@@ -6219,15 +6009,7 @@
     </w:p>
     <w:p>
       <w:r>
-        <w:t>[</w:t>
-      </w:r>
-      <w:proofErr w:type="spellStart"/>
-      <w:r>
-        <w:t>dataorganisation</w:t>
-      </w:r>
-      <w:proofErr w:type="spellEnd"/>
-      <w:r>
-        <w:t>]</w:t>
+        <w:t>[dataorganisation]</w:t>
       </w:r>
     </w:p>
     <w:p>
@@ -6600,23 +6382,13 @@
           <w:color w:val="auto"/>
         </w:rPr>
       </w:pPr>
-      <w:proofErr w:type="spellStart"/>
       <w:r>
         <w:rPr>
           <w:b/>
           <w:bCs/>
           <w:color w:val="auto"/>
         </w:rPr>
-        <w:t>Metadata</w:t>
-      </w:r>
-      <w:proofErr w:type="spellEnd"/>
-      <w:r>
-        <w:rPr>
-          <w:b/>
-          <w:bCs/>
-          <w:color w:val="auto"/>
-        </w:rPr>
-        <w:t>:</w:t>
+        <w:t>Metadata:</w:t>
       </w:r>
     </w:p>
     <w:p>
@@ -7019,25 +6791,7 @@
                 <w:sz w:val="18"/>
                 <w:szCs w:val="18"/>
               </w:rPr>
-              <w:t>[</w:t>
-            </w:r>
-            <w:proofErr w:type="spellStart"/>
-            <w:r>
-              <w:rPr>
-                <w:color w:val="auto"/>
-                <w:sz w:val="18"/>
-                <w:szCs w:val="18"/>
-              </w:rPr>
-              <w:t>datasetPublicationTable</w:t>
-            </w:r>
-            <w:proofErr w:type="spellEnd"/>
-            <w:r>
-              <w:rPr>
-                <w:color w:val="auto"/>
-                <w:sz w:val="18"/>
-                <w:szCs w:val="18"/>
-              </w:rPr>
-              <w:t>]</w:t>
+              <w:t>[datasetPublicationTable]</w:t>
             </w:r>
           </w:p>
         </w:tc>
@@ -7312,21 +7066,13 @@
         <w:spacing w:before="240"/>
       </w:pPr>
       <w:r>
-        <w:t>[</w:t>
-      </w:r>
-      <w:proofErr w:type="spellStart"/>
-      <w:r>
-        <w:t>closed</w:t>
+        <w:t>[closed</w:t>
       </w:r>
       <w:r>
         <w:t>restricted</w:t>
       </w:r>
       <w:r>
-        <w:t>datasetreasons</w:t>
-      </w:r>
-      <w:proofErr w:type="spellEnd"/>
-      <w:r>
-        <w:t>]</w:t>
+        <w:t>datasetreasons]</w:t>
       </w:r>
     </w:p>
     <w:p>
@@ -7334,15 +7080,7 @@
         <w:spacing w:before="240"/>
       </w:pPr>
       <w:r>
-        <w:t>[</w:t>
-      </w:r>
-      <w:proofErr w:type="spellStart"/>
-      <w:r>
-        <w:t>repoinformation</w:t>
-      </w:r>
-      <w:proofErr w:type="spellEnd"/>
-      <w:r>
-        <w:t>]</w:t>
+        <w:t>[repoinformation]</w:t>
       </w:r>
     </w:p>
     <w:p>
@@ -7355,15 +7093,7 @@
     </w:p>
     <w:p>
       <w:r>
-        <w:t>[</w:t>
-      </w:r>
-      <w:proofErr w:type="spellStart"/>
-      <w:r>
-        <w:t>restrictedAccessInfo</w:t>
-      </w:r>
-      <w:proofErr w:type="spellEnd"/>
-      <w:r>
-        <w:t>]</w:t>
+        <w:t>[restrictedAccessInfo]</w:t>
       </w:r>
     </w:p>
     <w:p>
@@ -7693,15 +7423,7 @@
         <w:ind w:right="243"/>
       </w:pPr>
       <w:r>
-        <w:t>[</w:t>
-      </w:r>
-      <w:proofErr w:type="spellStart"/>
-      <w:r>
-        <w:t>dataqualitycontrol</w:t>
-      </w:r>
-      <w:proofErr w:type="spellEnd"/>
-      <w:r>
-        <w:t>]</w:t>
+        <w:t>[dataqualitycontrol]</w:t>
       </w:r>
     </w:p>
     <w:p>
@@ -8205,27 +7927,7 @@
                 <w:sz w:val="18"/>
                 <w:szCs w:val="18"/>
               </w:rPr>
-              <w:t>[</w:t>
-            </w:r>
-            <w:proofErr w:type="spellStart"/>
-            <w:r>
-              <w:rPr>
-                <w:bCs/>
-                <w:color w:val="000000" w:themeColor="text1"/>
-                <w:sz w:val="18"/>
-                <w:szCs w:val="18"/>
-              </w:rPr>
-              <w:t>costTable</w:t>
-            </w:r>
-            <w:proofErr w:type="spellEnd"/>
-            <w:r>
-              <w:rPr>
-                <w:bCs/>
-                <w:color w:val="000000" w:themeColor="text1"/>
-                <w:sz w:val="18"/>
-                <w:szCs w:val="18"/>
-              </w:rPr>
-              <w:t>]</w:t>
+              <w:t>[costTable]</w:t>
             </w:r>
           </w:p>
         </w:tc>
@@ -8253,27 +7955,7 @@
                 <w:sz w:val="18"/>
                 <w:szCs w:val="18"/>
               </w:rPr>
-              <w:t>[</w:t>
-            </w:r>
-            <w:proofErr w:type="spellStart"/>
-            <w:r>
-              <w:rPr>
-                <w:bCs/>
-                <w:color w:val="000000" w:themeColor="text1"/>
-                <w:sz w:val="18"/>
-                <w:szCs w:val="18"/>
-              </w:rPr>
-              <w:t>costTable</w:t>
-            </w:r>
-            <w:proofErr w:type="spellEnd"/>
-            <w:r>
-              <w:rPr>
-                <w:bCs/>
-                <w:color w:val="000000" w:themeColor="text1"/>
-                <w:sz w:val="18"/>
-                <w:szCs w:val="18"/>
-              </w:rPr>
-              <w:t>]</w:t>
+              <w:t>[costTable]</w:t>
             </w:r>
           </w:p>
         </w:tc>
@@ -8600,29 +8282,7 @@
                 <w:sz w:val="18"/>
                 <w:szCs w:val="18"/>
               </w:rPr>
-              <w:t>[</w:t>
-            </w:r>
-            <w:proofErr w:type="spellStart"/>
-            <w:r>
-              <w:rPr>
-                <w:b/>
-                <w:bCs/>
-                <w:color w:val="000000" w:themeColor="text1"/>
-                <w:sz w:val="18"/>
-                <w:szCs w:val="18"/>
-              </w:rPr>
-              <w:t>costtotal</w:t>
-            </w:r>
-            <w:proofErr w:type="spellEnd"/>
-            <w:r>
-              <w:rPr>
-                <w:b/>
-                <w:bCs/>
-                <w:color w:val="000000" w:themeColor="text1"/>
-                <w:sz w:val="18"/>
-                <w:szCs w:val="18"/>
-              </w:rPr>
-              <w:t>]</w:t>
+              <w:t>[costtotal]</w:t>
             </w:r>
           </w:p>
         </w:tc>
@@ -8696,21 +8356,7 @@
         <w:rPr>
           <w:color w:val="auto"/>
         </w:rPr>
-        <w:t>[</w:t>
-      </w:r>
-      <w:proofErr w:type="spellStart"/>
-      <w:r>
-        <w:rPr>
-          <w:color w:val="auto"/>
-        </w:rPr>
-        <w:t>workPackageLeaders</w:t>
-      </w:r>
-      <w:proofErr w:type="spellEnd"/>
-      <w:r>
-        <w:rPr>
-          <w:color w:val="auto"/>
-        </w:rPr>
-        <w:t>] being responsible for ensuring metadata production, day-to-day cross-checks, back-up and other quality control activities are maintained. The researchers will be responsible for routine supervision of the dataset development.</w:t>
+        <w:t>[workPackageLeaders] being responsible for ensuring metadata production, day-to-day cross-checks, back-up and other quality control activities are maintained. The researchers will be responsible for routine supervision of the dataset development.</w:t>
       </w:r>
     </w:p>
     <w:p>
@@ -8817,23 +8463,7 @@
           <w:rFonts w:eastAsiaTheme="minorEastAsia"/>
           <w:lang w:val="en-GB"/>
         </w:rPr>
-        <w:t>[</w:t>
-      </w:r>
-      <w:proofErr w:type="spellStart"/>
-      <w:r>
-        <w:rPr>
-          <w:rFonts w:eastAsiaTheme="minorEastAsia"/>
-          <w:lang w:val="en-GB"/>
-        </w:rPr>
-        <w:t>storageintro</w:t>
-      </w:r>
-      <w:proofErr w:type="spellEnd"/>
-      <w:r>
-        <w:rPr>
-          <w:rFonts w:eastAsiaTheme="minorEastAsia"/>
-          <w:lang w:val="en-GB"/>
-        </w:rPr>
-        <w:t>]</w:t>
+        <w:t>[storageintro]</w:t>
       </w:r>
     </w:p>
     <w:p>
@@ -8880,23 +8510,7 @@
           <w:rFonts w:eastAsiaTheme="minorEastAsia"/>
           <w:lang w:val="en-GB"/>
         </w:rPr>
-        <w:t>[</w:t>
-      </w:r>
-      <w:proofErr w:type="spellStart"/>
-      <w:r>
-        <w:rPr>
-          <w:rFonts w:eastAsiaTheme="minorEastAsia"/>
-          <w:lang w:val="en-GB"/>
-        </w:rPr>
-        <w:t>sensitivedata</w:t>
-      </w:r>
-      <w:proofErr w:type="spellEnd"/>
-      <w:r>
-        <w:rPr>
-          <w:rFonts w:eastAsiaTheme="minorEastAsia"/>
-          <w:lang w:val="en-GB"/>
-        </w:rPr>
-        <w:t>]</w:t>
+        <w:t>[sensitivedata]</w:t>
       </w:r>
     </w:p>
     <w:p>
@@ -9111,25 +8725,7 @@
                 <w:sz w:val="18"/>
                 <w:szCs w:val="18"/>
               </w:rPr>
-              <w:t>[</w:t>
-            </w:r>
-            <w:proofErr w:type="spellStart"/>
-            <w:r>
-              <w:rPr>
-                <w:color w:val="000000" w:themeColor="text1"/>
-                <w:sz w:val="18"/>
-                <w:szCs w:val="18"/>
-              </w:rPr>
-              <w:t>datasetAccessTable</w:t>
-            </w:r>
-            <w:proofErr w:type="spellEnd"/>
-            <w:r>
-              <w:rPr>
-                <w:color w:val="000000" w:themeColor="text1"/>
-                <w:sz w:val="18"/>
-                <w:szCs w:val="18"/>
-              </w:rPr>
-              <w:t>]</w:t>
+              <w:t>[datasetAccessTable]</w:t>
             </w:r>
           </w:p>
         </w:tc>
@@ -9521,25 +9117,7 @@
                 <w:sz w:val="18"/>
                 <w:szCs w:val="18"/>
               </w:rPr>
-              <w:t>[</w:t>
-            </w:r>
-            <w:proofErr w:type="spellStart"/>
-            <w:r>
-              <w:rPr>
-                <w:color w:val="000000" w:themeColor="text1"/>
-                <w:sz w:val="18"/>
-                <w:szCs w:val="18"/>
-              </w:rPr>
-              <w:t>datasetRepositoryTable</w:t>
-            </w:r>
-            <w:proofErr w:type="spellEnd"/>
-            <w:r>
-              <w:rPr>
-                <w:color w:val="000000" w:themeColor="text1"/>
-                <w:sz w:val="18"/>
-                <w:szCs w:val="18"/>
-              </w:rPr>
-              <w:t>]</w:t>
+              <w:t>[datasetRepositoryTable]</w:t>
             </w:r>
           </w:p>
         </w:tc>
@@ -9883,25 +9461,7 @@
                 <w:sz w:val="18"/>
                 <w:szCs w:val="18"/>
               </w:rPr>
-              <w:t>[</w:t>
-            </w:r>
-            <w:proofErr w:type="spellStart"/>
-            <w:r>
-              <w:rPr>
-                <w:color w:val="000000" w:themeColor="text1"/>
-                <w:sz w:val="18"/>
-                <w:szCs w:val="18"/>
-              </w:rPr>
-              <w:t>datasetDeleteTable</w:t>
-            </w:r>
-            <w:proofErr w:type="spellEnd"/>
-            <w:r>
-              <w:rPr>
-                <w:color w:val="000000" w:themeColor="text1"/>
-                <w:sz w:val="18"/>
-                <w:szCs w:val="18"/>
-              </w:rPr>
-              <w:t>]</w:t>
+              <w:t>[datasetDeleteTable]</w:t>
             </w:r>
           </w:p>
         </w:tc>
@@ -9927,25 +9487,7 @@
                 <w:sz w:val="18"/>
                 <w:szCs w:val="18"/>
               </w:rPr>
-              <w:t>[</w:t>
-            </w:r>
-            <w:proofErr w:type="spellStart"/>
-            <w:r>
-              <w:rPr>
-                <w:color w:val="000000" w:themeColor="text1"/>
-                <w:sz w:val="18"/>
-                <w:szCs w:val="18"/>
-              </w:rPr>
-              <w:t>datasetDeleteTable</w:t>
-            </w:r>
-            <w:proofErr w:type="spellEnd"/>
-            <w:r>
-              <w:rPr>
-                <w:color w:val="000000" w:themeColor="text1"/>
-                <w:sz w:val="18"/>
-                <w:szCs w:val="18"/>
-              </w:rPr>
-              <w:t>]</w:t>
+              <w:t>[datasetDeleteTable]</w:t>
             </w:r>
           </w:p>
         </w:tc>
@@ -10161,23 +9703,7 @@
           <w:color w:val="000000"/>
           <w:lang w:val="en-GB"/>
         </w:rPr>
-        <w:t>Are there, or could there be, any ethics or legal issues that can have an impact on data sharing? These can also be discussed in the context of the ethics review. If relevant, include references to ethics deliverables and ethics chapter in the Description of the Action (</w:t>
-      </w:r>
-      <w:proofErr w:type="spellStart"/>
-      <w:r>
-        <w:rPr>
-          <w:color w:val="000000"/>
-          <w:lang w:val="en-GB"/>
-        </w:rPr>
-        <w:t>DoA</w:t>
-      </w:r>
-      <w:proofErr w:type="spellEnd"/>
-      <w:r>
-        <w:rPr>
-          <w:color w:val="000000"/>
-          <w:lang w:val="en-GB"/>
-        </w:rPr>
-        <w:t>).</w:t>
+        <w:t>Are there, or could there be, any ethics or legal issues that can have an impact on data sharing? These can also be discussed in the context of the ethics review. If relevant, include references to ethics deliverables and ethics chapter in the Description of the Action (DoA).</w:t>
       </w:r>
     </w:p>
     <w:p>
@@ -10222,15 +9748,7 @@
     </w:p>
     <w:p>
       <w:r>
-        <w:t>[</w:t>
-      </w:r>
-      <w:proofErr w:type="spellStart"/>
-      <w:r>
-        <w:t>personaldata</w:t>
-      </w:r>
-      <w:proofErr w:type="spellEnd"/>
-      <w:r>
-        <w:t>]</w:t>
+        <w:t>[personaldata]</w:t>
       </w:r>
     </w:p>
     <w:p>
@@ -10243,15 +9761,7 @@
     </w:p>
     <w:p>
       <w:r>
-        <w:t>[</w:t>
-      </w:r>
-      <w:proofErr w:type="spellStart"/>
-      <w:r>
-        <w:t>legalrestriction</w:t>
-      </w:r>
-      <w:proofErr w:type="spellEnd"/>
-      <w:r>
-        <w:t>]</w:t>
+        <w:t>[legalrestriction]</w:t>
       </w:r>
     </w:p>
     <w:p>
@@ -10268,15 +9778,7 @@
     </w:p>
     <w:p>
       <w:r>
-        <w:t>[</w:t>
-      </w:r>
-      <w:proofErr w:type="spellStart"/>
-      <w:r>
-        <w:t>ethicalissues</w:t>
-      </w:r>
-      <w:proofErr w:type="spellEnd"/>
-      <w:r>
-        <w:t>]</w:t>
+        <w:t>[ethicalissues]</w:t>
       </w:r>
     </w:p>
     <w:p>
@@ -10480,14 +9982,7 @@
       <w:rPr>
         <w:color w:val="000000" w:themeColor="text1"/>
       </w:rPr>
-      <w:t>[</w:t>
-    </w:r>
-    <w:proofErr w:type="spellStart"/>
-    <w:r>
-      <w:rPr>
-        <w:color w:val="000000" w:themeColor="text1"/>
-      </w:rPr>
-      <w:t>projectname</w:t>
+      <w:t>[projectname</w:t>
     </w:r>
     <w:r>
       <w:rPr>
@@ -10495,7 +9990,6 @@
       </w:rPr>
       <w:t>Text</w:t>
     </w:r>
-    <w:proofErr w:type="spellEnd"/>
     <w:r>
       <w:rPr>
         <w:color w:val="000000" w:themeColor="text1"/>
@@ -10503,35 +9997,13 @@
       <w:t xml:space="preserve">] </w:t>
     </w:r>
     <w:r>
-      <w:t xml:space="preserve">has received funding from the European Union’s Horizon Europe research and innovation </w:t>
-    </w:r>
-    <w:proofErr w:type="spellStart"/>
-    <w:r>
-      <w:t>Programme</w:t>
-    </w:r>
-    <w:proofErr w:type="spellEnd"/>
-    <w:r>
-      <w:t xml:space="preserve"> under Grant Agreement No</w:t>
+      <w:t>has received funding from the European Union’s Horizon Europe research and innovation Programme under Grant Agreement No</w:t>
     </w:r>
     <w:r>
       <w:rPr>
         <w:color w:val="000000" w:themeColor="text1"/>
       </w:rPr>
-      <w:t>. [</w:t>
-    </w:r>
-    <w:proofErr w:type="spellStart"/>
-    <w:r>
-      <w:rPr>
-        <w:color w:val="000000" w:themeColor="text1"/>
-      </w:rPr>
-      <w:t>grantid</w:t>
-    </w:r>
-    <w:proofErr w:type="spellEnd"/>
-    <w:r>
-      <w:rPr>
-        <w:color w:val="000000" w:themeColor="text1"/>
-      </w:rPr>
-      <w:t>].</w:t>
+      <w:t>. [grantid].</w:t>
     </w:r>
   </w:p>
 </w:ftr>
@@ -13313,6 +12785,10 @@
 </file>
 
 <file path=customXml/item1.xml><?xml version="1.0" encoding="utf-8"?>
+<b:Sources xmlns:b="http://schemas.openxmlformats.org/officeDocument/2006/bibliography" xmlns="http://schemas.openxmlformats.org/officeDocument/2006/bibliography" SelectedStyle="\APASixthEditionOfficeOnline.xsl" StyleName="APA" Version="6"/>
+</file>
+
+<file path=customXml/item2.xml><?xml version="1.0" encoding="utf-8"?>
 <?mso-contentType ?>
 <FormTemplates xmlns="http://schemas.microsoft.com/sharepoint/v3/contenttype/forms">
   <Display>DocumentLibraryForm</Display>
@@ -13321,31 +12797,7 @@
 </FormTemplates>
 </file>
 
-<file path=customXml/item2.xml><?xml version="1.0" encoding="utf-8"?>
-<b:Sources xmlns:b="http://schemas.openxmlformats.org/officeDocument/2006/bibliography" xmlns="http://schemas.openxmlformats.org/officeDocument/2006/bibliography" SelectedStyle="\APASixthEditionOfficeOnline.xsl" StyleName="APA" Version="6"/>
-</file>
-
 <file path=customXml/item3.xml><?xml version="1.0" encoding="utf-8"?>
-<p:properties xmlns:p="http://schemas.microsoft.com/office/2006/metadata/properties" xmlns:xsi="http://www.w3.org/2001/XMLSchema-instance" xmlns:pc="http://schemas.microsoft.com/office/infopath/2007/PartnerControls">
-  <documentManagement>
-    <Order1 xmlns="084a5cd8-1559-4e94-ac72-b94fb9abc19e">45</Order1>
-    <DocComments xmlns="084a5cd8-1559-4e94-ac72-b94fb9abc19e" xsi:nil="true"/>
-    <DocPublversion xmlns="084a5cd8-1559-4e94-ac72-b94fb9abc19e">1</DocPublversion>
-    <DocInternalExternal xmlns="084a5cd8-1559-4e94-ac72-b94fb9abc19e">External</DocInternalExternal>
-    <ProgrCategory xmlns="084a5cd8-1559-4e94-ac72-b94fb9abc19e">3. Customised reports &amp; forms</ProgrCategory>
-    <ProgrGroup xmlns="084a5cd8-1559-4e94-ac72-b94fb9abc19e">01 HORIZON and EURATOM</ProgrGroup>
-    <DocStatus xmlns="084a5cd8-1559-4e94-ac72-b94fb9abc19e">Published</DocStatus>
-    <DocPublDestination xmlns="084a5cd8-1559-4e94-ac72-b94fb9abc19e" xsi:nil="true"/>
-    <DocPublProtocol xmlns="084a5cd8-1559-4e94-ac72-b94fb9abc19e">TPL2-2 Programme tpl - Application forms, etc</DocPublProtocol>
-    <DocOfficerComments xmlns="084a5cd8-1559-4e94-ac72-b94fb9abc19e" xsi:nil="true"/>
-    <DocPublDate xmlns="084a5cd8-1559-4e94-ac72-b94fb9abc19e">2021-05-04T22:00:00+00:00</DocPublDate>
-    <ITcomments xmlns="084a5cd8-1559-4e94-ac72-b94fb9abc19e" xsi:nil="true"/>
-    <ITstatus xmlns="084a5cd8-1559-4e94-ac72-b94fb9abc19e" xsi:nil="true"/>
-  </documentManagement>
-</p:properties>
-</file>
-
-<file path=customXml/item4.xml><?xml version="1.0" encoding="utf-8"?>
 <ct:contentTypeSchema xmlns:ct="http://schemas.microsoft.com/office/2006/metadata/contentType" xmlns:ma="http://schemas.microsoft.com/office/2006/metadata/properties/metaAttributes" ct:_="" ma:_="" ma:contentTypeName="EC Document" ma:contentTypeID="0x010100258AA79CEB83498886A3A086811232500015D68561EDF2314DA91E1210E4D82B5C" ma:contentTypeVersion="38" ma:contentTypeDescription="Create a new document in this library." ma:contentTypeScope="" ma:versionID="3bfd783927ea96c5c14b5f9466c0d5de">
   <xsd:schema xmlns:xsd="http://www.w3.org/2001/XMLSchema" xmlns:xs="http://www.w3.org/2001/XMLSchema" xmlns:p="http://schemas.microsoft.com/office/2006/metadata/properties" xmlns:ns2="084a5cd8-1559-4e94-ac72-b94fb9abc19e" targetNamespace="http://schemas.microsoft.com/office/2006/metadata/properties" ma:root="true" ma:fieldsID="6907ed16e1ea7430830aa2dae5b3c1f7" ns2:_="">
     <xsd:import namespace="084a5cd8-1559-4e94-ac72-b94fb9abc19e"/>
@@ -13687,7 +13139,35 @@
 </ct:contentTypeSchema>
 </file>
 
+<file path=customXml/item4.xml><?xml version="1.0" encoding="utf-8"?>
+<p:properties xmlns:p="http://schemas.microsoft.com/office/2006/metadata/properties" xmlns:xsi="http://www.w3.org/2001/XMLSchema-instance" xmlns:pc="http://schemas.microsoft.com/office/infopath/2007/PartnerControls">
+  <documentManagement>
+    <Order1 xmlns="084a5cd8-1559-4e94-ac72-b94fb9abc19e">45</Order1>
+    <DocComments xmlns="084a5cd8-1559-4e94-ac72-b94fb9abc19e" xsi:nil="true"/>
+    <DocPublversion xmlns="084a5cd8-1559-4e94-ac72-b94fb9abc19e">1</DocPublversion>
+    <DocInternalExternal xmlns="084a5cd8-1559-4e94-ac72-b94fb9abc19e">External</DocInternalExternal>
+    <ProgrCategory xmlns="084a5cd8-1559-4e94-ac72-b94fb9abc19e">3. Customised reports &amp; forms</ProgrCategory>
+    <ProgrGroup xmlns="084a5cd8-1559-4e94-ac72-b94fb9abc19e">01 HORIZON and EURATOM</ProgrGroup>
+    <DocStatus xmlns="084a5cd8-1559-4e94-ac72-b94fb9abc19e">Published</DocStatus>
+    <DocPublDestination xmlns="084a5cd8-1559-4e94-ac72-b94fb9abc19e" xsi:nil="true"/>
+    <DocPublProtocol xmlns="084a5cd8-1559-4e94-ac72-b94fb9abc19e">TPL2-2 Programme tpl - Application forms, etc</DocPublProtocol>
+    <DocOfficerComments xmlns="084a5cd8-1559-4e94-ac72-b94fb9abc19e" xsi:nil="true"/>
+    <DocPublDate xmlns="084a5cd8-1559-4e94-ac72-b94fb9abc19e">2021-05-04T22:00:00+00:00</DocPublDate>
+    <ITcomments xmlns="084a5cd8-1559-4e94-ac72-b94fb9abc19e" xsi:nil="true"/>
+    <ITstatus xmlns="084a5cd8-1559-4e94-ac72-b94fb9abc19e" xsi:nil="true"/>
+  </documentManagement>
+</p:properties>
+</file>
+
 <file path=customXml/itemProps1.xml><?xml version="1.0" encoding="utf-8"?>
+<ds:datastoreItem xmlns:ds="http://schemas.openxmlformats.org/officeDocument/2006/customXml" ds:itemID="{E6E3F1C5-BDFC-4981-9034-4A05696CDD37}">
+  <ds:schemaRefs>
+    <ds:schemaRef ds:uri="http://schemas.openxmlformats.org/officeDocument/2006/bibliography"/>
+  </ds:schemaRefs>
+</ds:datastoreItem>
+</file>
+
+<file path=customXml/itemProps2.xml><?xml version="1.0" encoding="utf-8"?>
 <ds:datastoreItem xmlns:ds="http://schemas.openxmlformats.org/officeDocument/2006/customXml" ds:itemID="{E5ABEBC2-8F24-42D8-B0A5-1D2B76C15645}">
   <ds:schemaRefs>
     <ds:schemaRef ds:uri="http://schemas.microsoft.com/sharepoint/v3/contenttype/forms"/>
@@ -13695,25 +13175,7 @@
 </ds:datastoreItem>
 </file>
 
-<file path=customXml/itemProps2.xml><?xml version="1.0" encoding="utf-8"?>
-<ds:datastoreItem xmlns:ds="http://schemas.openxmlformats.org/officeDocument/2006/customXml" ds:itemID="{E6E3F1C5-BDFC-4981-9034-4A05696CDD37}">
-  <ds:schemaRefs>
-    <ds:schemaRef ds:uri="http://schemas.openxmlformats.org/officeDocument/2006/bibliography"/>
-  </ds:schemaRefs>
-</ds:datastoreItem>
-</file>
-
 <file path=customXml/itemProps3.xml><?xml version="1.0" encoding="utf-8"?>
-<ds:datastoreItem xmlns:ds="http://schemas.openxmlformats.org/officeDocument/2006/customXml" ds:itemID="{FA90FD41-FA76-42DA-A088-7C01AECDABAA}">
-  <ds:schemaRefs>
-    <ds:schemaRef ds:uri="http://schemas.microsoft.com/office/2006/metadata/properties"/>
-    <ds:schemaRef ds:uri="http://schemas.microsoft.com/office/infopath/2007/PartnerControls"/>
-    <ds:schemaRef ds:uri="084a5cd8-1559-4e94-ac72-b94fb9abc19e"/>
-  </ds:schemaRefs>
-</ds:datastoreItem>
-</file>
-
-<file path=customXml/itemProps4.xml><?xml version="1.0" encoding="utf-8"?>
 <ds:datastoreItem xmlns:ds="http://schemas.openxmlformats.org/officeDocument/2006/customXml" ds:itemID="{789122CC-B268-41FA-A377-ABDD5160F69C}">
   <ds:schemaRefs>
     <ds:schemaRef ds:uri="http://schemas.microsoft.com/office/2006/metadata/contentType"/>
@@ -13729,4 +13191,14 @@
     <ds:schemaRef ds:uri="http://schemas.microsoft.com/internal/obd"/>
   </ds:schemaRefs>
 </ds:datastoreItem>
+</file>
+
+<file path=customXml/itemProps4.xml><?xml version="1.0" encoding="utf-8"?>
+<ds:datastoreItem xmlns:ds="http://schemas.openxmlformats.org/officeDocument/2006/customXml" ds:itemID="{FA90FD41-FA76-42DA-A088-7C01AECDABAA}">
+  <ds:schemaRefs>
+    <ds:schemaRef ds:uri="http://schemas.microsoft.com/office/2006/metadata/properties"/>
+    <ds:schemaRef ds:uri="http://schemas.microsoft.com/office/infopath/2007/PartnerControls"/>
+    <ds:schemaRef ds:uri="084a5cd8-1559-4e94-ac72-b94fb9abc19e"/>
+  </ds:schemaRefs>
+</ds:datastoreItem>
 </file>
</xml_diff>

<commit_message>
Add the funder in the SE template
</commit_message>
<xml_diff>
--- a/src/main/resources/org/damap/base/template/horizonEuropeTemplate.docx
+++ b/src/main/resources/org/damap/base/template/horizonEuropeTemplate.docx
@@ -603,19 +603,13 @@
         <w:rPr>
           <w:color w:val="000000" w:themeColor="text1"/>
         </w:rPr>
-        <w:t>] project is funded by the European Union Horizon Europe programme under Grant Agreement No [grant</w:t>
+        <w:t xml:space="preserve">] project is funded by the European Union Horizon Europe programme under Grant Agreement No </w:t>
       </w:r>
       <w:r>
         <w:rPr>
           <w:color w:val="000000" w:themeColor="text1"/>
         </w:rPr>
-        <w:t>id</w:t>
-      </w:r>
-      <w:r>
-        <w:rPr>
-          <w:color w:val="000000" w:themeColor="text1"/>
-        </w:rPr>
-        <w:t>]</w:t>
+        <w:t>[grantid]</w:t>
       </w:r>
       <w:r>
         <w:rPr>

</xml_diff>

<commit_message>
HE-Template: Fix the verbiage for contact person in contibutors table
</commit_message>
<xml_diff>
--- a/src/main/resources/org/damap/base/template/horizonEuropeTemplate.docx
+++ b/src/main/resources/org/damap/base/template/horizonEuropeTemplate.docx
@@ -2152,13 +2152,13 @@
         <w:tblLook w:val="0400" w:firstRow="0" w:lastRow="0" w:firstColumn="0" w:lastColumn="0" w:noHBand="0" w:noVBand="1"/>
       </w:tblPr>
       <w:tblGrid>
-        <w:gridCol w:w="2112"/>
-        <w:gridCol w:w="7087"/>
+        <w:gridCol w:w="2505"/>
+        <w:gridCol w:w="6694"/>
       </w:tblGrid>
       <w:tr>
         <w:tc>
           <w:tcPr>
-            <w:tcW w:w="2112" w:type="dxa"/>
+            <w:tcW w:w="2505" w:type="dxa"/>
             <w:tcBorders>
               <w:top w:val="single" w:sz="12" w:space="0" w:color="BFBFBF"/>
               <w:left w:val="single" w:sz="12" w:space="0" w:color="BFBFBF"/>
@@ -2190,7 +2190,7 @@
         </w:tc>
         <w:tc>
           <w:tcPr>
-            <w:tcW w:w="7087" w:type="dxa"/>
+            <w:tcW w:w="6694" w:type="dxa"/>
             <w:tcBorders>
               <w:top w:val="single" w:sz="12" w:space="0" w:color="BFBFBF"/>
               <w:left w:val="single" w:sz="12" w:space="0" w:color="BFBFBF"/>
@@ -2225,7 +2225,7 @@
       <w:tr>
         <w:tc>
           <w:tcPr>
-            <w:tcW w:w="2112" w:type="dxa"/>
+            <w:tcW w:w="2505" w:type="dxa"/>
             <w:tcBorders>
               <w:top w:val="single" w:sz="12" w:space="0" w:color="BFBFBF"/>
               <w:left w:val="single" w:sz="12" w:space="0" w:color="BFBFBF"/>
@@ -2271,7 +2271,7 @@
         </w:tc>
         <w:tc>
           <w:tcPr>
-            <w:tcW w:w="7087" w:type="dxa"/>
+            <w:tcW w:w="6694" w:type="dxa"/>
             <w:tcBorders>
               <w:top w:val="single" w:sz="12" w:space="0" w:color="BFBFBF"/>
               <w:left w:val="single" w:sz="12" w:space="0" w:color="BFBFBF"/>
@@ -2307,7 +2307,7 @@
       <w:tr>
         <w:tc>
           <w:tcPr>
-            <w:tcW w:w="2112" w:type="dxa"/>
+            <w:tcW w:w="2505" w:type="dxa"/>
             <w:tcBorders>
               <w:top w:val="single" w:sz="12" w:space="0" w:color="BFBFBF"/>
               <w:left w:val="single" w:sz="12" w:space="0" w:color="BFBFBF"/>
@@ -2329,30 +2329,18 @@
             </w:pPr>
             <w:r>
               <w:rPr>
-                <w:bCs/>
                 <w:color w:val="auto"/>
                 <w:sz w:val="20"/>
                 <w:szCs w:val="20"/>
                 <w:lang w:val="en-GB"/>
               </w:rPr>
-              <w:t>Project Coordinator</w:t>
-            </w:r>
-            <w:r>
-              <w:rPr>
-                <w:bCs/>
-                <w:color w:val="auto"/>
-                <w:sz w:val="20"/>
-                <w:szCs w:val="20"/>
-                <w:lang w:val="en-GB"/>
-              </w:rPr>
-              <w:br/>
-              <w:t>Principal Investigator</w:t>
-            </w:r>
-          </w:p>
-        </w:tc>
-        <w:tc>
-          <w:tcPr>
-            <w:tcW w:w="7087" w:type="dxa"/>
+              <w:t>Contact person (responsible for data management and DMP)</w:t>
+            </w:r>
+          </w:p>
+        </w:tc>
+        <w:tc>
+          <w:tcPr>
+            <w:tcW w:w="6694" w:type="dxa"/>
             <w:tcBorders>
               <w:top w:val="single" w:sz="12" w:space="0" w:color="BFBFBF"/>
               <w:left w:val="single" w:sz="12" w:space="0" w:color="BFBFBF"/>
@@ -2387,7 +2375,7 @@
       <w:tr>
         <w:tc>
           <w:tcPr>
-            <w:tcW w:w="2112" w:type="dxa"/>
+            <w:tcW w:w="2505" w:type="dxa"/>
             <w:tcBorders>
               <w:top w:val="single" w:sz="12" w:space="0" w:color="BFBFBF"/>
               <w:left w:val="single" w:sz="12" w:space="0" w:color="BFBFBF"/>
@@ -2420,7 +2408,7 @@
         </w:tc>
         <w:tc>
           <w:tcPr>
-            <w:tcW w:w="7087" w:type="dxa"/>
+            <w:tcW w:w="6694" w:type="dxa"/>
             <w:tcBorders>
               <w:top w:val="single" w:sz="12" w:space="0" w:color="BFBFBF"/>
               <w:left w:val="single" w:sz="12" w:space="0" w:color="BFBFBF"/>

</xml_diff>

<commit_message>
Template: Update terminology section in HE Template
</commit_message>
<xml_diff>
--- a/src/main/resources/org/damap/base/template/horizonEuropeTemplate.docx
+++ b/src/main/resources/org/damap/base/template/horizonEuropeTemplate.docx
@@ -17,7 +17,29 @@
           <w:sz w:val="72"/>
           <w:szCs w:val="72"/>
         </w:rPr>
-        <w:t>[projectname]</w:t>
+        <w:t>[</w:t>
+      </w:r>
+      <w:proofErr w:type="spellStart"/>
+      <w:r>
+        <w:rPr>
+          <w:b/>
+          <w:bCs/>
+          <w:color w:val="000000" w:themeColor="text1"/>
+          <w:sz w:val="72"/>
+          <w:szCs w:val="72"/>
+        </w:rPr>
+        <w:t>projectname</w:t>
+      </w:r>
+      <w:proofErr w:type="spellEnd"/>
+      <w:r>
+        <w:rPr>
+          <w:b/>
+          <w:bCs/>
+          <w:color w:val="000000" w:themeColor="text1"/>
+          <w:sz w:val="72"/>
+          <w:szCs w:val="72"/>
+        </w:rPr>
+        <w:t>]</w:t>
       </w:r>
     </w:p>
     <w:p>
@@ -535,22 +557,45 @@
               <w:rPr>
                 <w:rFonts w:eastAsia="Arial"/>
               </w:rPr>
-              <w:t>This deliverable is the initial Data Management Plan (DMP) for t</w:t>
+              <w:t xml:space="preserve">This </w:t>
+            </w:r>
+            <w:proofErr w:type="gramStart"/>
+            <w:r>
+              <w:rPr>
+                <w:rFonts w:eastAsia="Arial"/>
+              </w:rPr>
+              <w:t>deliverable</w:t>
+            </w:r>
+            <w:proofErr w:type="gramEnd"/>
+            <w:r>
+              <w:rPr>
+                <w:rFonts w:eastAsia="Arial"/>
+              </w:rPr>
+              <w:t xml:space="preserve"> is the initial Data Management Plan (DMP) for t</w:t>
             </w:r>
             <w:r>
               <w:rPr>
                 <w:rFonts w:eastAsia="Arial"/>
                 <w:color w:val="000000" w:themeColor="text1"/>
               </w:rPr>
-              <w:t>he [projectname</w:t>
-            </w:r>
+              <w:t>he [</w:t>
+            </w:r>
+            <w:proofErr w:type="spellStart"/>
             <w:r>
               <w:rPr>
                 <w:rFonts w:eastAsia="Arial"/>
                 <w:color w:val="000000" w:themeColor="text1"/>
               </w:rPr>
+              <w:t>projectname</w:t>
+            </w:r>
+            <w:r>
+              <w:rPr>
+                <w:rFonts w:eastAsia="Arial"/>
+                <w:color w:val="000000" w:themeColor="text1"/>
+              </w:rPr>
               <w:t>Text</w:t>
             </w:r>
+            <w:proofErr w:type="spellEnd"/>
             <w:r>
               <w:rPr>
                 <w:rFonts w:eastAsia="Arial"/>
@@ -671,14 +716,22 @@
         <w:rPr>
           <w:color w:val="000000" w:themeColor="text1"/>
         </w:rPr>
-        <w:t>This work by parties of the [projectname</w:t>
-      </w:r>
+        <w:t>This work by parties of the [</w:t>
+      </w:r>
+      <w:proofErr w:type="spellStart"/>
       <w:r>
         <w:rPr>
           <w:color w:val="000000" w:themeColor="text1"/>
         </w:rPr>
+        <w:t>projectname</w:t>
+      </w:r>
+      <w:r>
+        <w:rPr>
+          <w:color w:val="000000" w:themeColor="text1"/>
+        </w:rPr>
         <w:t>Text</w:t>
       </w:r>
+      <w:proofErr w:type="spellEnd"/>
       <w:r>
         <w:rPr>
           <w:color w:val="000000" w:themeColor="text1"/>
@@ -699,25 +752,61 @@
         <w:rPr>
           <w:color w:val="000000" w:themeColor="text1"/>
         </w:rPr>
-        <w:t>). The [projectname</w:t>
-      </w:r>
+        <w:t>). The [</w:t>
+      </w:r>
+      <w:proofErr w:type="spellStart"/>
       <w:r>
         <w:rPr>
           <w:color w:val="000000" w:themeColor="text1"/>
         </w:rPr>
+        <w:t>projectname</w:t>
+      </w:r>
+      <w:r>
+        <w:rPr>
+          <w:color w:val="000000" w:themeColor="text1"/>
+        </w:rPr>
         <w:t>Text</w:t>
       </w:r>
+      <w:proofErr w:type="spellEnd"/>
       <w:r>
         <w:rPr>
           <w:color w:val="000000" w:themeColor="text1"/>
         </w:rPr>
-        <w:t xml:space="preserve">] project is funded by the European Union Horizon Europe programme under Grant Agreement No </w:t>
-      </w:r>
+        <w:t xml:space="preserve">] project is funded by the European Union Horizon Europe </w:t>
+      </w:r>
+      <w:proofErr w:type="spellStart"/>
       <w:r>
         <w:rPr>
           <w:color w:val="000000" w:themeColor="text1"/>
         </w:rPr>
-        <w:t>[grantid].</w:t>
+        <w:t>programme</w:t>
+      </w:r>
+      <w:proofErr w:type="spellEnd"/>
+      <w:r>
+        <w:rPr>
+          <w:color w:val="000000" w:themeColor="text1"/>
+        </w:rPr>
+        <w:t xml:space="preserve"> under Grant Agreement No </w:t>
+      </w:r>
+      <w:r>
+        <w:rPr>
+          <w:color w:val="000000" w:themeColor="text1"/>
+        </w:rPr>
+        <w:t>[</w:t>
+      </w:r>
+      <w:proofErr w:type="spellStart"/>
+      <w:r>
+        <w:rPr>
+          <w:color w:val="000000" w:themeColor="text1"/>
+        </w:rPr>
+        <w:t>grantid</w:t>
+      </w:r>
+      <w:proofErr w:type="spellEnd"/>
+      <w:r>
+        <w:rPr>
+          <w:color w:val="000000" w:themeColor="text1"/>
+        </w:rPr>
+        <w:t>].</w:t>
       </w:r>
     </w:p>
     <w:p>
@@ -1540,7 +1629,27 @@
                 <w:sz w:val="20"/>
                 <w:szCs w:val="20"/>
               </w:rPr>
-              <w:t>[dd.mm.yyyy]</w:t>
+              <w:t>[</w:t>
+            </w:r>
+            <w:proofErr w:type="spellStart"/>
+            <w:proofErr w:type="gramStart"/>
+            <w:r>
+              <w:rPr>
+                <w:color w:val="92D050"/>
+                <w:sz w:val="20"/>
+                <w:szCs w:val="20"/>
+              </w:rPr>
+              <w:t>dd.mm.yyyy</w:t>
+            </w:r>
+            <w:proofErr w:type="spellEnd"/>
+            <w:proofErr w:type="gramEnd"/>
+            <w:r>
+              <w:rPr>
+                <w:color w:val="92D050"/>
+                <w:sz w:val="20"/>
+                <w:szCs w:val="20"/>
+              </w:rPr>
+              <w:t>]</w:t>
             </w:r>
           </w:p>
         </w:tc>
@@ -1761,21 +1870,12 @@
     </w:p>
     <w:p>
       <w:pPr>
-        <w:rPr>
-          <w:color w:val="2E74B5" w:themeColor="accent1" w:themeShade="BF"/>
-        </w:rPr>
-      </w:pPr>
-      <w:hyperlink r:id="rId13" w:tgtFrame="https://eosc-portal.eu/glossary">
-        <w:r>
-          <w:rPr>
-            <w:rStyle w:val="Hyperlink"/>
-            <w:rFonts w:ascii="Open Sans" w:hAnsi="Open Sans"/>
-            <w:color w:val="2E74B5" w:themeColor="accent1" w:themeShade="BF"/>
-            <w:sz w:val="22"/>
-          </w:rPr>
-          <w:t>https://eosc-portal.eu/glossary</w:t>
-        </w:r>
-      </w:hyperlink>
+        <w:spacing w:before="240"/>
+        <w:rPr>
+          <w:b/>
+          <w:bCs/>
+        </w:rPr>
+      </w:pPr>
     </w:p>
     <w:tbl>
       <w:tblPr>
@@ -1823,7 +1923,7 @@
         </w:tc>
         <w:tc>
           <w:tcPr>
-            <w:tcW w:w="7086" w:type="dxa"/>
+            <w:tcW w:w="7087" w:type="dxa"/>
             <w:tcBorders>
               <w:top w:val="single" w:sz="12" w:space="0" w:color="BFBFBF"/>
               <w:left w:val="single" w:sz="12" w:space="0" w:color="BFBFBF"/>
@@ -1886,7 +1986,7 @@
         </w:tc>
         <w:tc>
           <w:tcPr>
-            <w:tcW w:w="7086" w:type="dxa"/>
+            <w:tcW w:w="7087" w:type="dxa"/>
             <w:tcBorders>
               <w:top w:val="single" w:sz="12" w:space="0" w:color="BFBFBF"/>
               <w:left w:val="single" w:sz="12" w:space="0" w:color="BFBFBF"/>
@@ -1943,7 +2043,7 @@
         </w:tc>
         <w:tc>
           <w:tcPr>
-            <w:tcW w:w="7086" w:type="dxa"/>
+            <w:tcW w:w="7087" w:type="dxa"/>
             <w:tcBorders>
               <w:top w:val="single" w:sz="12" w:space="0" w:color="BFBFBF"/>
               <w:left w:val="single" w:sz="12" w:space="0" w:color="BFBFBF"/>
@@ -1993,13 +2093,13 @@
               </w:rPr>
             </w:pPr>
             <w:r>
-              <w:t>EOSC</w:t>
-            </w:r>
-          </w:p>
-        </w:tc>
-        <w:tc>
-          <w:tcPr>
-            <w:tcW w:w="7086" w:type="dxa"/>
+              <w:t>FAIR</w:t>
+            </w:r>
+          </w:p>
+        </w:tc>
+        <w:tc>
+          <w:tcPr>
+            <w:tcW w:w="7087" w:type="dxa"/>
             <w:tcBorders>
               <w:top w:val="single" w:sz="12" w:space="0" w:color="BFBFBF"/>
               <w:left w:val="single" w:sz="12" w:space="0" w:color="BFBFBF"/>
@@ -2020,7 +2120,7 @@
               </w:rPr>
             </w:pPr>
             <w:r>
-              <w:t>European Open Science Cloud</w:t>
+              <w:t>FAIR-Principles: Findable, Accessible, Interoperable, and Reusable</w:t>
             </w:r>
           </w:p>
         </w:tc>
@@ -2041,21 +2141,15 @@
               <w:widowControl w:val="0"/>
               <w:spacing w:before="60" w:after="60"/>
               <w:jc w:val="left"/>
-              <w:rPr>
-                <w:color w:val="000000"/>
-                <w:sz w:val="20"/>
-                <w:szCs w:val="20"/>
-                <w:lang w:val="en-GB"/>
-              </w:rPr>
-            </w:pPr>
-            <w:r>
-              <w:t>FAIR</w:t>
-            </w:r>
-          </w:p>
-        </w:tc>
-        <w:tc>
-          <w:tcPr>
-            <w:tcW w:w="7086" w:type="dxa"/>
+            </w:pPr>
+            <w:r>
+              <w:t>MB</w:t>
+            </w:r>
+          </w:p>
+        </w:tc>
+        <w:tc>
+          <w:tcPr>
+            <w:tcW w:w="7087" w:type="dxa"/>
             <w:tcBorders>
               <w:top w:val="single" w:sz="12" w:space="0" w:color="BFBFBF"/>
               <w:left w:val="single" w:sz="12" w:space="0" w:color="BFBFBF"/>
@@ -2068,15 +2162,9 @@
               <w:widowControl w:val="0"/>
               <w:spacing w:before="60" w:after="60"/>
               <w:jc w:val="left"/>
-              <w:rPr>
-                <w:color w:val="000000"/>
-                <w:sz w:val="20"/>
-                <w:szCs w:val="20"/>
-                <w:lang w:val="en-GB"/>
-              </w:rPr>
-            </w:pPr>
-            <w:r>
-              <w:t>FAIR-Principles: Findable, Accessible, Interoperable, and Reusable</w:t>
+            </w:pPr>
+            <w:r>
+              <w:t>Megabyte</w:t>
             </w:r>
           </w:p>
         </w:tc>
@@ -2099,13 +2187,13 @@
               <w:jc w:val="left"/>
             </w:pPr>
             <w:r>
-              <w:t>MB</w:t>
-            </w:r>
-          </w:p>
-        </w:tc>
-        <w:tc>
-          <w:tcPr>
-            <w:tcW w:w="7086" w:type="dxa"/>
+              <w:t>PDF</w:t>
+            </w:r>
+          </w:p>
+        </w:tc>
+        <w:tc>
+          <w:tcPr>
+            <w:tcW w:w="7087" w:type="dxa"/>
             <w:tcBorders>
               <w:top w:val="single" w:sz="12" w:space="0" w:color="BFBFBF"/>
               <w:left w:val="single" w:sz="12" w:space="0" w:color="BFBFBF"/>
@@ -2120,7 +2208,7 @@
               <w:jc w:val="left"/>
             </w:pPr>
             <w:r>
-              <w:t>Megabyte</w:t>
+              <w:t xml:space="preserve">Portable Document Format </w:t>
             </w:r>
           </w:p>
         </w:tc>
@@ -2143,57 +2231,13 @@
               <w:jc w:val="left"/>
             </w:pPr>
             <w:r>
-              <w:t>PDF</w:t>
-            </w:r>
-          </w:p>
-        </w:tc>
-        <w:tc>
-          <w:tcPr>
-            <w:tcW w:w="7086" w:type="dxa"/>
-            <w:tcBorders>
-              <w:top w:val="single" w:sz="12" w:space="0" w:color="BFBFBF"/>
-              <w:left w:val="single" w:sz="12" w:space="0" w:color="BFBFBF"/>
-              <w:bottom w:val="single" w:sz="12" w:space="0" w:color="BFBFBF"/>
-              <w:right w:val="single" w:sz="12" w:space="0" w:color="BFBFBF"/>
-            </w:tcBorders>
-          </w:tcPr>
-          <w:p>
-            <w:pPr>
-              <w:widowControl w:val="0"/>
-              <w:spacing w:before="60" w:after="60"/>
-              <w:jc w:val="left"/>
-            </w:pPr>
-            <w:r>
-              <w:t xml:space="preserve">Portable Document Format </w:t>
-            </w:r>
-          </w:p>
-        </w:tc>
-      </w:tr>
-      <w:tr>
-        <w:tc>
-          <w:tcPr>
-            <w:tcW w:w="2112" w:type="dxa"/>
-            <w:tcBorders>
-              <w:top w:val="single" w:sz="12" w:space="0" w:color="BFBFBF"/>
-              <w:left w:val="single" w:sz="12" w:space="0" w:color="BFBFBF"/>
-              <w:bottom w:val="single" w:sz="12" w:space="0" w:color="BFBFBF"/>
-              <w:right w:val="single" w:sz="12" w:space="0" w:color="BFBFBF"/>
-            </w:tcBorders>
-          </w:tcPr>
-          <w:p>
-            <w:pPr>
-              <w:widowControl w:val="0"/>
-              <w:spacing w:before="60" w:after="60"/>
-              <w:jc w:val="left"/>
-            </w:pPr>
-            <w:r>
               <w:t>WP</w:t>
             </w:r>
           </w:p>
         </w:tc>
         <w:tc>
           <w:tcPr>
-            <w:tcW w:w="7086" w:type="dxa"/>
+            <w:tcW w:w="7087" w:type="dxa"/>
             <w:tcBorders>
               <w:top w:val="single" w:sz="12" w:space="0" w:color="BFBFBF"/>
               <w:left w:val="single" w:sz="12" w:space="0" w:color="BFBFBF"/>
@@ -4648,7 +4692,7 @@
       <w:r>
         <w:t xml:space="preserve">A data management plan (DMP) is a structured document that keeps record of what research data is created or reused and what happens to that data during and after a project. It helps with planning the research process and defining responsibilities in a research project involving several researchers or institutions. For writing this DMP, we followed the </w:t>
       </w:r>
-      <w:hyperlink r:id="rId14">
+      <w:hyperlink r:id="rId13">
         <w:r>
           <w:rPr>
             <w:rStyle w:val="Hyperlink"/>
@@ -4672,21 +4716,53 @@
           <w:bCs/>
           <w:color w:val="404040"/>
         </w:rPr>
-        <w:t>[datamanager]</w:t>
-      </w:r>
+        <w:t>[</w:t>
+      </w:r>
+      <w:proofErr w:type="spellStart"/>
       <w:r>
         <w:rPr>
           <w:bCs/>
           <w:color w:val="404040"/>
         </w:rPr>
-        <w:t xml:space="preserve"> </w:t>
-      </w:r>
+        <w:t>datamanager</w:t>
+      </w:r>
+      <w:proofErr w:type="spellEnd"/>
       <w:r>
         <w:rPr>
           <w:bCs/>
           <w:color w:val="404040"/>
         </w:rPr>
-        <w:t>[datamanagerInfo]</w:t>
+        <w:t>]</w:t>
+      </w:r>
+      <w:r>
+        <w:rPr>
+          <w:bCs/>
+          <w:color w:val="404040"/>
+        </w:rPr>
+        <w:t xml:space="preserve"> </w:t>
+      </w:r>
+      <w:r>
+        <w:rPr>
+          <w:bCs/>
+          <w:color w:val="404040"/>
+        </w:rPr>
+        <w:t>[</w:t>
+      </w:r>
+      <w:proofErr w:type="spellStart"/>
+      <w:r>
+        <w:rPr>
+          <w:bCs/>
+          <w:color w:val="404040"/>
+        </w:rPr>
+        <w:t>datamanagerInfo</w:t>
+      </w:r>
+      <w:proofErr w:type="spellEnd"/>
+      <w:r>
+        <w:rPr>
+          <w:bCs/>
+          <w:color w:val="404040"/>
+        </w:rPr>
+        <w:t>]</w:t>
       </w:r>
     </w:p>
     <w:p>
@@ -5173,7 +5249,25 @@
                 <w:sz w:val="18"/>
                 <w:szCs w:val="18"/>
               </w:rPr>
-              <w:t>[datasetTable]</w:t>
+              <w:t>[</w:t>
+            </w:r>
+            <w:proofErr w:type="spellStart"/>
+            <w:r>
+              <w:rPr>
+                <w:color w:val="auto"/>
+                <w:sz w:val="18"/>
+                <w:szCs w:val="18"/>
+              </w:rPr>
+              <w:t>datasetTable</w:t>
+            </w:r>
+            <w:proofErr w:type="spellEnd"/>
+            <w:r>
+              <w:rPr>
+                <w:color w:val="auto"/>
+                <w:sz w:val="18"/>
+                <w:szCs w:val="18"/>
+              </w:rPr>
+              <w:t>]</w:t>
             </w:r>
           </w:p>
         </w:tc>
@@ -5452,7 +5546,21 @@
         <w:rPr>
           <w:color w:val="auto"/>
         </w:rPr>
-        <w:t>[produceddatadescription]</w:t>
+        <w:t>[</w:t>
+      </w:r>
+      <w:proofErr w:type="spellStart"/>
+      <w:r>
+        <w:rPr>
+          <w:color w:val="auto"/>
+        </w:rPr>
+        <w:t>produceddatadescription</w:t>
+      </w:r>
+      <w:proofErr w:type="spellEnd"/>
+      <w:r>
+        <w:rPr>
+          <w:color w:val="auto"/>
+        </w:rPr>
+        <w:t>]</w:t>
       </w:r>
     </w:p>
     <w:p>
@@ -5465,7 +5573,21 @@
         <w:rPr>
           <w:color w:val="auto"/>
         </w:rPr>
-        <w:t>[datasetTechnicalResources]</w:t>
+        <w:t>[</w:t>
+      </w:r>
+      <w:proofErr w:type="spellStart"/>
+      <w:r>
+        <w:rPr>
+          <w:color w:val="auto"/>
+        </w:rPr>
+        <w:t>datasetTechnicalResources</w:t>
+      </w:r>
+      <w:proofErr w:type="spellEnd"/>
+      <w:r>
+        <w:rPr>
+          <w:color w:val="auto"/>
+        </w:rPr>
+        <w:t>]</w:t>
       </w:r>
     </w:p>
     <w:p>
@@ -5716,7 +5838,25 @@
                 <w:sz w:val="18"/>
                 <w:szCs w:val="18"/>
               </w:rPr>
-              <w:t>[reusedDatasetTable]</w:t>
+              <w:t>[</w:t>
+            </w:r>
+            <w:proofErr w:type="spellStart"/>
+            <w:r>
+              <w:rPr>
+                <w:color w:val="auto"/>
+                <w:sz w:val="18"/>
+                <w:szCs w:val="18"/>
+              </w:rPr>
+              <w:t>reusedDatasetTable</w:t>
+            </w:r>
+            <w:proofErr w:type="spellEnd"/>
+            <w:r>
+              <w:rPr>
+                <w:color w:val="auto"/>
+                <w:sz w:val="18"/>
+                <w:szCs w:val="18"/>
+              </w:rPr>
+              <w:t>]</w:t>
             </w:r>
           </w:p>
         </w:tc>
@@ -5922,7 +6062,15 @@
     <w:p>
       <w:bookmarkStart w:id="12" w:name="_Toc156287341"/>
       <w:r>
-        <w:t>[reuseddatadescription]</w:t>
+        <w:t>[</w:t>
+      </w:r>
+      <w:proofErr w:type="spellStart"/>
+      <w:r>
+        <w:t>reuseddatadescription</w:t>
+      </w:r>
+      <w:proofErr w:type="spellEnd"/>
+      <w:r>
+        <w:t>]</w:t>
       </w:r>
     </w:p>
     <w:p>
@@ -5948,7 +6096,23 @@
           <w:rFonts w:eastAsiaTheme="minorEastAsia"/>
           <w:color w:val="auto"/>
         </w:rPr>
-        <w:t>[datageneration]</w:t>
+        <w:t>[</w:t>
+      </w:r>
+      <w:proofErr w:type="spellStart"/>
+      <w:r>
+        <w:rPr>
+          <w:rFonts w:eastAsiaTheme="minorEastAsia"/>
+          <w:color w:val="auto"/>
+        </w:rPr>
+        <w:t>datageneration</w:t>
+      </w:r>
+      <w:proofErr w:type="spellEnd"/>
+      <w:r>
+        <w:rPr>
+          <w:rFonts w:eastAsiaTheme="minorEastAsia"/>
+          <w:color w:val="auto"/>
+        </w:rPr>
+        <w:t>]</w:t>
       </w:r>
     </w:p>
     <w:p>
@@ -5968,7 +6132,15 @@
         </w:rPr>
       </w:pPr>
       <w:r>
-        <w:t>[targetaudience]</w:t>
+        <w:t>[</w:t>
+      </w:r>
+      <w:proofErr w:type="spellStart"/>
+      <w:r>
+        <w:t>targetaudience</w:t>
+      </w:r>
+      <w:proofErr w:type="spellEnd"/>
+      <w:r>
+        <w:t>]</w:t>
       </w:r>
     </w:p>
     <w:p>
@@ -6118,7 +6290,15 @@
     </w:p>
     <w:p>
       <w:r>
-        <w:t>We will make our data findable by uploading it to a data repository that provides a persistent identifier, and adding relevant metadata.</w:t>
+        <w:t xml:space="preserve">We will make our data findable by uploading it to a data repository that provides a persistent </w:t>
+      </w:r>
+      <w:proofErr w:type="gramStart"/>
+      <w:r>
+        <w:t>identifier, and</w:t>
+      </w:r>
+      <w:proofErr w:type="gramEnd"/>
+      <w:r>
+        <w:t xml:space="preserve"> adding relevant metadata.</w:t>
       </w:r>
       <w:r>
         <w:t xml:space="preserve"> </w:t>
@@ -6129,7 +6309,15 @@
     </w:p>
     <w:p>
       <w:r>
-        <w:t>[dataorganisation]</w:t>
+        <w:t>[</w:t>
+      </w:r>
+      <w:proofErr w:type="spellStart"/>
+      <w:r>
+        <w:t>dataorganisation</w:t>
+      </w:r>
+      <w:proofErr w:type="spellEnd"/>
+      <w:r>
+        <w:t>]</w:t>
       </w:r>
     </w:p>
     <w:p>
@@ -6509,13 +6697,23 @@
           <w:color w:val="auto"/>
         </w:rPr>
       </w:pPr>
+      <w:proofErr w:type="spellStart"/>
       <w:r>
         <w:rPr>
           <w:b/>
           <w:bCs/>
           <w:color w:val="auto"/>
         </w:rPr>
-        <w:t>Metadata:</w:t>
+        <w:t>Metadata</w:t>
+      </w:r>
+      <w:proofErr w:type="spellEnd"/>
+      <w:r>
+        <w:rPr>
+          <w:b/>
+          <w:bCs/>
+          <w:color w:val="auto"/>
+        </w:rPr>
+        <w:t>:</w:t>
       </w:r>
     </w:p>
     <w:p>
@@ -6602,7 +6800,23 @@
           <w:color w:val="auto"/>
           <w:lang w:val="en-GB"/>
         </w:rPr>
-        <w:t>Will documentation or reference about any software be needed to access or read the data be included? Will it be possible to include the relevant software (e.g. in open source code)?</w:t>
+        <w:t xml:space="preserve">Will documentation or reference about any software be needed to access or read the data be included? Will it be possible to include the relevant software (e.g. in </w:t>
+      </w:r>
+      <w:proofErr w:type="gramStart"/>
+      <w:r>
+        <w:rPr>
+          <w:color w:val="auto"/>
+          <w:lang w:val="en-GB"/>
+        </w:rPr>
+        <w:t>open source</w:t>
+      </w:r>
+      <w:proofErr w:type="gramEnd"/>
+      <w:r>
+        <w:rPr>
+          <w:color w:val="auto"/>
+          <w:lang w:val="en-GB"/>
+        </w:rPr>
+        <w:t xml:space="preserve"> code)?</w:t>
       </w:r>
     </w:p>
     <w:p>
@@ -6918,7 +7132,25 @@
                 <w:sz w:val="18"/>
                 <w:szCs w:val="18"/>
               </w:rPr>
-              <w:t>[datasetPublicationTable]</w:t>
+              <w:t>[</w:t>
+            </w:r>
+            <w:proofErr w:type="spellStart"/>
+            <w:r>
+              <w:rPr>
+                <w:color w:val="auto"/>
+                <w:sz w:val="18"/>
+                <w:szCs w:val="18"/>
+              </w:rPr>
+              <w:t>datasetPublicationTable</w:t>
+            </w:r>
+            <w:proofErr w:type="spellEnd"/>
+            <w:r>
+              <w:rPr>
+                <w:color w:val="auto"/>
+                <w:sz w:val="18"/>
+                <w:szCs w:val="18"/>
+              </w:rPr>
+              <w:t>]</w:t>
             </w:r>
           </w:p>
         </w:tc>
@@ -7193,13 +7425,21 @@
         <w:spacing w:before="240"/>
       </w:pPr>
       <w:r>
-        <w:t>[closed</w:t>
+        <w:t>[</w:t>
+      </w:r>
+      <w:proofErr w:type="spellStart"/>
+      <w:r>
+        <w:t>closed</w:t>
       </w:r>
       <w:r>
         <w:t>restricted</w:t>
       </w:r>
       <w:r>
-        <w:t>datasetreasons]</w:t>
+        <w:t>datasetreasons</w:t>
+      </w:r>
+      <w:proofErr w:type="spellEnd"/>
+      <w:r>
+        <w:t>]</w:t>
       </w:r>
     </w:p>
     <w:p>
@@ -7207,7 +7447,15 @@
         <w:spacing w:before="240"/>
       </w:pPr>
       <w:r>
-        <w:t>[repoinformation]</w:t>
+        <w:t>[</w:t>
+      </w:r>
+      <w:proofErr w:type="spellStart"/>
+      <w:r>
+        <w:t>repoinformation</w:t>
+      </w:r>
+      <w:proofErr w:type="spellEnd"/>
+      <w:r>
+        <w:t>]</w:t>
       </w:r>
     </w:p>
     <w:p>
@@ -7220,7 +7468,15 @@
     </w:p>
     <w:p>
       <w:r>
-        <w:t>[restrictedAccessInfo]</w:t>
+        <w:t>[</w:t>
+      </w:r>
+      <w:proofErr w:type="spellStart"/>
+      <w:r>
+        <w:t>restrictedAccessInfo</w:t>
+      </w:r>
+      <w:proofErr w:type="spellEnd"/>
+      <w:r>
+        <w:t>]</w:t>
       </w:r>
     </w:p>
     <w:p>
@@ -7445,7 +7701,23 @@
           <w:color w:val="auto"/>
           <w:lang w:val="en-GB"/>
         </w:rPr>
-        <w:t>Will the data produced in the project be useable by third parties, in particular after the end of the project?</w:t>
+        <w:t xml:space="preserve">Will the data produced in the project be useable by third parties, </w:t>
+      </w:r>
+      <w:proofErr w:type="gramStart"/>
+      <w:r>
+        <w:rPr>
+          <w:color w:val="auto"/>
+          <w:lang w:val="en-GB"/>
+        </w:rPr>
+        <w:t>in particular after</w:t>
+      </w:r>
+      <w:proofErr w:type="gramEnd"/>
+      <w:r>
+        <w:rPr>
+          <w:color w:val="auto"/>
+          <w:lang w:val="en-GB"/>
+        </w:rPr>
+        <w:t xml:space="preserve"> the end of the project?</w:t>
       </w:r>
     </w:p>
     <w:p>
@@ -7537,7 +7809,15 @@
     </w:p>
     <w:p>
       <w:r>
-        <w:t>We will make our data reusable by adding metadata and comprehensive Readme files to all published datasets. The descriptions will include details on the methodology used, analytical, and procedural information. In case of publication, licenses for code and data will always be assigned and clearly marked. The digital research data obtained will be published Open Access under a Creative Commons CC BY license, provided that there are no data protection concerns.</w:t>
+        <w:t xml:space="preserve">We will make our data reusable by adding metadata and comprehensive Readme files to all published datasets. The descriptions will include details on the methodology used, analytical, and procedural information. In case of publication, licenses for code and data will always be assigned and clearly marked. The digital research data obtained will be published Open Access under a Creative Commons CC BY license, </w:t>
+      </w:r>
+      <w:proofErr w:type="gramStart"/>
+      <w:r>
+        <w:t>provided that</w:t>
+      </w:r>
+      <w:proofErr w:type="gramEnd"/>
+      <w:r>
+        <w:t xml:space="preserve"> there are no data protection concerns.</w:t>
       </w:r>
     </w:p>
     <w:p>
@@ -7550,7 +7830,15 @@
         <w:ind w:right="243"/>
       </w:pPr>
       <w:r>
-        <w:t>[dataqualitycontrol]</w:t>
+        <w:t>[</w:t>
+      </w:r>
+      <w:proofErr w:type="spellStart"/>
+      <w:r>
+        <w:t>dataqualitycontrol</w:t>
+      </w:r>
+      <w:proofErr w:type="spellEnd"/>
+      <w:r>
+        <w:t>]</w:t>
       </w:r>
     </w:p>
     <w:p>
@@ -8048,7 +8336,27 @@
                 <w:sz w:val="18"/>
                 <w:szCs w:val="18"/>
               </w:rPr>
-              <w:t>[costTable]</w:t>
+              <w:t>[</w:t>
+            </w:r>
+            <w:proofErr w:type="spellStart"/>
+            <w:r>
+              <w:rPr>
+                <w:bCs/>
+                <w:color w:val="000000" w:themeColor="text1"/>
+                <w:sz w:val="18"/>
+                <w:szCs w:val="18"/>
+              </w:rPr>
+              <w:t>costTable</w:t>
+            </w:r>
+            <w:proofErr w:type="spellEnd"/>
+            <w:r>
+              <w:rPr>
+                <w:bCs/>
+                <w:color w:val="000000" w:themeColor="text1"/>
+                <w:sz w:val="18"/>
+                <w:szCs w:val="18"/>
+              </w:rPr>
+              <w:t>]</w:t>
             </w:r>
           </w:p>
         </w:tc>
@@ -8076,7 +8384,27 @@
                 <w:sz w:val="18"/>
                 <w:szCs w:val="18"/>
               </w:rPr>
-              <w:t>[costTable]</w:t>
+              <w:t>[</w:t>
+            </w:r>
+            <w:proofErr w:type="spellStart"/>
+            <w:r>
+              <w:rPr>
+                <w:bCs/>
+                <w:color w:val="000000" w:themeColor="text1"/>
+                <w:sz w:val="18"/>
+                <w:szCs w:val="18"/>
+              </w:rPr>
+              <w:t>costTable</w:t>
+            </w:r>
+            <w:proofErr w:type="spellEnd"/>
+            <w:r>
+              <w:rPr>
+                <w:bCs/>
+                <w:color w:val="000000" w:themeColor="text1"/>
+                <w:sz w:val="18"/>
+                <w:szCs w:val="18"/>
+              </w:rPr>
+              <w:t>]</w:t>
             </w:r>
           </w:p>
         </w:tc>
@@ -8403,7 +8731,29 @@
                 <w:sz w:val="18"/>
                 <w:szCs w:val="18"/>
               </w:rPr>
-              <w:t>[costtotal]</w:t>
+              <w:t>[</w:t>
+            </w:r>
+            <w:proofErr w:type="spellStart"/>
+            <w:r>
+              <w:rPr>
+                <w:b/>
+                <w:bCs/>
+                <w:color w:val="000000" w:themeColor="text1"/>
+                <w:sz w:val="18"/>
+                <w:szCs w:val="18"/>
+              </w:rPr>
+              <w:t>costtotal</w:t>
+            </w:r>
+            <w:proofErr w:type="spellEnd"/>
+            <w:r>
+              <w:rPr>
+                <w:b/>
+                <w:bCs/>
+                <w:color w:val="000000" w:themeColor="text1"/>
+                <w:sz w:val="18"/>
+                <w:szCs w:val="18"/>
+              </w:rPr>
+              <w:t>]</w:t>
             </w:r>
           </w:p>
         </w:tc>
@@ -8424,7 +8774,25 @@
           <w:color w:val="auto"/>
           <w:lang w:val="en-GB"/>
         </w:rPr>
-        <w:t>[costsDescriptions]</w:t>
+        <w:t>[</w:t>
+      </w:r>
+      <w:proofErr w:type="spellStart"/>
+      <w:r>
+        <w:rPr>
+          <w:rFonts w:eastAsiaTheme="minorEastAsia"/>
+          <w:color w:val="auto"/>
+          <w:lang w:val="en-GB"/>
+        </w:rPr>
+        <w:t>costsDescriptions</w:t>
+      </w:r>
+      <w:proofErr w:type="spellEnd"/>
+      <w:r>
+        <w:rPr>
+          <w:rFonts w:eastAsiaTheme="minorEastAsia"/>
+          <w:color w:val="auto"/>
+          <w:lang w:val="en-GB"/>
+        </w:rPr>
+        <w:t>]</w:t>
       </w:r>
       <w:r>
         <w:rPr>
@@ -8432,15 +8800,16 @@
           <w:color w:val="92D050"/>
           <w:lang w:val="en-GB"/>
         </w:rPr>
-        <w:t>[cost</w:t>
-      </w:r>
+        <w:t>[</w:t>
+      </w:r>
+      <w:proofErr w:type="spellStart"/>
       <w:r>
         <w:rPr>
           <w:rFonts w:eastAsiaTheme="minorEastAsia"/>
           <w:color w:val="92D050"/>
           <w:lang w:val="en-GB"/>
         </w:rPr>
-        <w:t>C</w:t>
+        <w:t>cost</w:t>
       </w:r>
       <w:r>
         <w:rPr>
@@ -8448,7 +8817,24 @@
           <w:color w:val="92D050"/>
           <w:lang w:val="en-GB"/>
         </w:rPr>
-        <w:t>overage]</w:t>
+        <w:t>C</w:t>
+      </w:r>
+      <w:r>
+        <w:rPr>
+          <w:rFonts w:eastAsiaTheme="minorEastAsia"/>
+          <w:color w:val="92D050"/>
+          <w:lang w:val="en-GB"/>
+        </w:rPr>
+        <w:t>overage</w:t>
+      </w:r>
+      <w:proofErr w:type="spellEnd"/>
+      <w:r>
+        <w:rPr>
+          <w:rFonts w:eastAsiaTheme="minorEastAsia"/>
+          <w:color w:val="92D050"/>
+          <w:lang w:val="en-GB"/>
+        </w:rPr>
+        <w:t>]</w:t>
       </w:r>
     </w:p>
     <w:p>
@@ -8486,7 +8872,21 @@
         <w:rPr>
           <w:color w:val="auto"/>
         </w:rPr>
-        <w:t>[workPackageLeaders] being responsible for ensuring metadata production, day-to-day cross-checks, back-up and other quality control activities are maintained. The researchers will be responsible for routine supervision of the dataset development.</w:t>
+        <w:t>[</w:t>
+      </w:r>
+      <w:proofErr w:type="spellStart"/>
+      <w:r>
+        <w:rPr>
+          <w:color w:val="auto"/>
+        </w:rPr>
+        <w:t>workPackageLeaders</w:t>
+      </w:r>
+      <w:proofErr w:type="spellEnd"/>
+      <w:r>
+        <w:rPr>
+          <w:color w:val="auto"/>
+        </w:rPr>
+        <w:t>] being responsible for ensuring metadata production, day-to-day cross-checks, back-up and other quality control activities are maintained. The researchers will be responsible for routine supervision of the dataset development.</w:t>
       </w:r>
     </w:p>
     <w:p>
@@ -8593,7 +8993,23 @@
           <w:rFonts w:eastAsiaTheme="minorEastAsia"/>
           <w:lang w:val="en-GB"/>
         </w:rPr>
-        <w:t>[storageintro]</w:t>
+        <w:t>[</w:t>
+      </w:r>
+      <w:proofErr w:type="spellStart"/>
+      <w:r>
+        <w:rPr>
+          <w:rFonts w:eastAsiaTheme="minorEastAsia"/>
+          <w:lang w:val="en-GB"/>
+        </w:rPr>
+        <w:t>storageintro</w:t>
+      </w:r>
+      <w:proofErr w:type="spellEnd"/>
+      <w:r>
+        <w:rPr>
+          <w:rFonts w:eastAsiaTheme="minorEastAsia"/>
+          <w:lang w:val="en-GB"/>
+        </w:rPr>
+        <w:t>]</w:t>
       </w:r>
     </w:p>
     <w:p>
@@ -8640,7 +9056,23 @@
           <w:rFonts w:eastAsiaTheme="minorEastAsia"/>
           <w:lang w:val="en-GB"/>
         </w:rPr>
-        <w:t>[sensitivedata]</w:t>
+        <w:t>[</w:t>
+      </w:r>
+      <w:proofErr w:type="spellStart"/>
+      <w:r>
+        <w:rPr>
+          <w:rFonts w:eastAsiaTheme="minorEastAsia"/>
+          <w:lang w:val="en-GB"/>
+        </w:rPr>
+        <w:t>sensitivedata</w:t>
+      </w:r>
+      <w:proofErr w:type="spellEnd"/>
+      <w:r>
+        <w:rPr>
+          <w:rFonts w:eastAsiaTheme="minorEastAsia"/>
+          <w:lang w:val="en-GB"/>
+        </w:rPr>
+        <w:t>]</w:t>
       </w:r>
     </w:p>
     <w:p>
@@ -8855,7 +9287,25 @@
                 <w:sz w:val="18"/>
                 <w:szCs w:val="18"/>
               </w:rPr>
-              <w:t>[datasetAccessTable]</w:t>
+              <w:t>[</w:t>
+            </w:r>
+            <w:proofErr w:type="spellStart"/>
+            <w:r>
+              <w:rPr>
+                <w:color w:val="000000" w:themeColor="text1"/>
+                <w:sz w:val="18"/>
+                <w:szCs w:val="18"/>
+              </w:rPr>
+              <w:t>datasetAccessTable</w:t>
+            </w:r>
+            <w:proofErr w:type="spellEnd"/>
+            <w:r>
+              <w:rPr>
+                <w:color w:val="000000" w:themeColor="text1"/>
+                <w:sz w:val="18"/>
+                <w:szCs w:val="18"/>
+              </w:rPr>
+              <w:t>]</w:t>
             </w:r>
           </w:p>
         </w:tc>
@@ -9247,7 +9697,25 @@
                 <w:sz w:val="18"/>
                 <w:szCs w:val="18"/>
               </w:rPr>
-              <w:t>[datasetRepositoryTable]</w:t>
+              <w:t>[</w:t>
+            </w:r>
+            <w:proofErr w:type="spellStart"/>
+            <w:r>
+              <w:rPr>
+                <w:color w:val="000000" w:themeColor="text1"/>
+                <w:sz w:val="18"/>
+                <w:szCs w:val="18"/>
+              </w:rPr>
+              <w:t>datasetRepositoryTable</w:t>
+            </w:r>
+            <w:proofErr w:type="spellEnd"/>
+            <w:r>
+              <w:rPr>
+                <w:color w:val="000000" w:themeColor="text1"/>
+                <w:sz w:val="18"/>
+                <w:szCs w:val="18"/>
+              </w:rPr>
+              <w:t>]</w:t>
             </w:r>
           </w:p>
         </w:tc>
@@ -9591,7 +10059,25 @@
                 <w:sz w:val="18"/>
                 <w:szCs w:val="18"/>
               </w:rPr>
-              <w:t>[datasetDeleteTable]</w:t>
+              <w:t>[</w:t>
+            </w:r>
+            <w:proofErr w:type="spellStart"/>
+            <w:r>
+              <w:rPr>
+                <w:color w:val="000000" w:themeColor="text1"/>
+                <w:sz w:val="18"/>
+                <w:szCs w:val="18"/>
+              </w:rPr>
+              <w:t>datasetDeleteTable</w:t>
+            </w:r>
+            <w:proofErr w:type="spellEnd"/>
+            <w:r>
+              <w:rPr>
+                <w:color w:val="000000" w:themeColor="text1"/>
+                <w:sz w:val="18"/>
+                <w:szCs w:val="18"/>
+              </w:rPr>
+              <w:t>]</w:t>
             </w:r>
           </w:p>
         </w:tc>
@@ -9617,7 +10103,25 @@
                 <w:sz w:val="18"/>
                 <w:szCs w:val="18"/>
               </w:rPr>
-              <w:t>[datasetDeleteTable]</w:t>
+              <w:t>[</w:t>
+            </w:r>
+            <w:proofErr w:type="spellStart"/>
+            <w:r>
+              <w:rPr>
+                <w:color w:val="000000" w:themeColor="text1"/>
+                <w:sz w:val="18"/>
+                <w:szCs w:val="18"/>
+              </w:rPr>
+              <w:t>datasetDeleteTable</w:t>
+            </w:r>
+            <w:proofErr w:type="spellEnd"/>
+            <w:r>
+              <w:rPr>
+                <w:color w:val="000000" w:themeColor="text1"/>
+                <w:sz w:val="18"/>
+                <w:szCs w:val="18"/>
+              </w:rPr>
+              <w:t>]</w:t>
             </w:r>
           </w:p>
         </w:tc>
@@ -9833,7 +10337,23 @@
           <w:color w:val="000000"/>
           <w:lang w:val="en-GB"/>
         </w:rPr>
-        <w:t>Are there, or could there be, any ethics or legal issues that can have an impact on data sharing? These can also be discussed in the context of the ethics review. If relevant, include references to ethics deliverables and ethics chapter in the Description of the Action (DoA).</w:t>
+        <w:t>Are there, or could there be, any ethics or legal issues that can have an impact on data sharing? These can also be discussed in the context of the ethics review. If relevant, include references to ethics deliverables and ethics chapter in the Description of the Action (</w:t>
+      </w:r>
+      <w:proofErr w:type="spellStart"/>
+      <w:r>
+        <w:rPr>
+          <w:color w:val="000000"/>
+          <w:lang w:val="en-GB"/>
+        </w:rPr>
+        <w:t>DoA</w:t>
+      </w:r>
+      <w:proofErr w:type="spellEnd"/>
+      <w:r>
+        <w:rPr>
+          <w:color w:val="000000"/>
+          <w:lang w:val="en-GB"/>
+        </w:rPr>
+        <w:t>).</w:t>
       </w:r>
     </w:p>
     <w:p>
@@ -9861,7 +10381,23 @@
           <w:color w:val="000000"/>
           <w:lang w:val="en-GB"/>
         </w:rPr>
-        <w:t>Will informed consent for data sharing and long term preservation be included in questionnaires dealing with personal data?</w:t>
+        <w:t xml:space="preserve">Will informed consent for data sharing and </w:t>
+      </w:r>
+      <w:proofErr w:type="gramStart"/>
+      <w:r>
+        <w:rPr>
+          <w:color w:val="000000"/>
+          <w:lang w:val="en-GB"/>
+        </w:rPr>
+        <w:t>long term</w:t>
+      </w:r>
+      <w:proofErr w:type="gramEnd"/>
+      <w:r>
+        <w:rPr>
+          <w:color w:val="000000"/>
+          <w:lang w:val="en-GB"/>
+        </w:rPr>
+        <w:t xml:space="preserve"> preservation be included in questionnaires dealing with personal data?</w:t>
       </w:r>
     </w:p>
     <w:p>
@@ -9878,7 +10414,15 @@
     </w:p>
     <w:p>
       <w:r>
-        <w:t>[personaldata]</w:t>
+        <w:t>[</w:t>
+      </w:r>
+      <w:proofErr w:type="spellStart"/>
+      <w:r>
+        <w:t>personaldata</w:t>
+      </w:r>
+      <w:proofErr w:type="spellEnd"/>
+      <w:r>
+        <w:t>]</w:t>
       </w:r>
     </w:p>
     <w:p>
@@ -9891,7 +10435,15 @@
     </w:p>
     <w:p>
       <w:r>
-        <w:t>[legalrestriction]</w:t>
+        <w:t>[</w:t>
+      </w:r>
+      <w:proofErr w:type="spellStart"/>
+      <w:r>
+        <w:t>legalrestriction</w:t>
+      </w:r>
+      <w:proofErr w:type="spellEnd"/>
+      <w:r>
+        <w:t>]</w:t>
       </w:r>
     </w:p>
     <w:p>
@@ -9908,7 +10460,15 @@
     </w:p>
     <w:p>
       <w:r>
-        <w:t>[ethicalissues]</w:t>
+        <w:t>[</w:t>
+      </w:r>
+      <w:proofErr w:type="spellStart"/>
+      <w:r>
+        <w:t>ethicalissues</w:t>
+      </w:r>
+      <w:proofErr w:type="spellEnd"/>
+      <w:r>
+        <w:t>]</w:t>
       </w:r>
     </w:p>
     <w:p>
@@ -9960,8 +10520,8 @@
       </w:pPr>
     </w:p>
     <w:sectPr>
-      <w:footerReference w:type="default" r:id="rId15"/>
-      <w:footerReference w:type="first" r:id="rId16"/>
+      <w:footerReference w:type="default" r:id="rId14"/>
+      <w:footerReference w:type="first" r:id="rId15"/>
       <w:pgSz w:w="11906" w:h="16838"/>
       <w:pgMar w:top="1701" w:right="1700" w:bottom="1134" w:left="1134" w:header="709" w:footer="709" w:gutter="0"/>
       <w:cols w:space="720"/>
@@ -10112,7 +10672,14 @@
       <w:rPr>
         <w:color w:val="000000" w:themeColor="text1"/>
       </w:rPr>
-      <w:t>[projectname</w:t>
+      <w:t>[</w:t>
+    </w:r>
+    <w:proofErr w:type="spellStart"/>
+    <w:r>
+      <w:rPr>
+        <w:color w:val="000000" w:themeColor="text1"/>
+      </w:rPr>
+      <w:t>projectname</w:t>
     </w:r>
     <w:r>
       <w:rPr>
@@ -10120,6 +10687,7 @@
       </w:rPr>
       <w:t>Text</w:t>
     </w:r>
+    <w:proofErr w:type="spellEnd"/>
     <w:r>
       <w:rPr>
         <w:color w:val="000000" w:themeColor="text1"/>
@@ -10127,13 +10695,35 @@
       <w:t xml:space="preserve">] </w:t>
     </w:r>
     <w:r>
-      <w:t>has received funding from the European Union’s Horizon Europe research and innovation Programme under Grant Agreement No</w:t>
+      <w:t xml:space="preserve">has received funding from the European Union’s Horizon Europe research and innovation </w:t>
+    </w:r>
+    <w:proofErr w:type="spellStart"/>
+    <w:r>
+      <w:t>Programme</w:t>
+    </w:r>
+    <w:proofErr w:type="spellEnd"/>
+    <w:r>
+      <w:t xml:space="preserve"> under Grant Agreement No</w:t>
     </w:r>
     <w:r>
       <w:rPr>
         <w:color w:val="000000" w:themeColor="text1"/>
       </w:rPr>
-      <w:t>. [grantid].</w:t>
+      <w:t>. [</w:t>
+    </w:r>
+    <w:proofErr w:type="spellStart"/>
+    <w:r>
+      <w:rPr>
+        <w:color w:val="000000" w:themeColor="text1"/>
+      </w:rPr>
+      <w:t>grantid</w:t>
+    </w:r>
+    <w:proofErr w:type="spellEnd"/>
+    <w:r>
+      <w:rPr>
+        <w:color w:val="000000" w:themeColor="text1"/>
+      </w:rPr>
+      <w:t>].</w:t>
     </w:r>
   </w:p>
 </w:ftr>
@@ -12915,6 +13505,10 @@
 </file>
 
 <file path=customXml/item1.xml><?xml version="1.0" encoding="utf-8"?>
+<b:Sources xmlns:b="http://schemas.openxmlformats.org/officeDocument/2006/bibliography" xmlns="http://schemas.openxmlformats.org/officeDocument/2006/bibliography" SelectedStyle="\APASixthEditionOfficeOnline.xsl" StyleName="APA" Version="6"/>
+</file>
+
+<file path=customXml/item2.xml><?xml version="1.0" encoding="utf-8"?>
 <p:properties xmlns:p="http://schemas.microsoft.com/office/2006/metadata/properties" xmlns:xsi="http://www.w3.org/2001/XMLSchema-instance" xmlns:pc="http://schemas.microsoft.com/office/infopath/2007/PartnerControls">
   <documentManagement>
     <Order1 xmlns="084a5cd8-1559-4e94-ac72-b94fb9abc19e">45</Order1>
@@ -12934,20 +13528,7 @@
 </p:properties>
 </file>
 
-<file path=customXml/item2.xml><?xml version="1.0" encoding="utf-8"?>
-<b:Sources xmlns:b="http://schemas.openxmlformats.org/officeDocument/2006/bibliography" xmlns="http://schemas.openxmlformats.org/officeDocument/2006/bibliography" SelectedStyle="\APASixthEditionOfficeOnline.xsl" StyleName="APA" Version="6"/>
-</file>
-
 <file path=customXml/item3.xml><?xml version="1.0" encoding="utf-8"?>
-<?mso-contentType ?>
-<FormTemplates xmlns="http://schemas.microsoft.com/sharepoint/v3/contenttype/forms">
-  <Display>DocumentLibraryForm</Display>
-  <Edit>DocumentLibraryForm</Edit>
-  <New>DocumentLibraryForm</New>
-</FormTemplates>
-</file>
-
-<file path=customXml/item4.xml><?xml version="1.0" encoding="utf-8"?>
 <ct:contentTypeSchema xmlns:ct="http://schemas.microsoft.com/office/2006/metadata/contentType" xmlns:ma="http://schemas.microsoft.com/office/2006/metadata/properties/metaAttributes" ct:_="" ma:_="" ma:contentTypeName="EC Document" ma:contentTypeID="0x010100258AA79CEB83498886A3A086811232500015D68561EDF2314DA91E1210E4D82B5C" ma:contentTypeVersion="38" ma:contentTypeDescription="Create a new document in this library." ma:contentTypeScope="" ma:versionID="3bfd783927ea96c5c14b5f9466c0d5de">
   <xsd:schema xmlns:xsd="http://www.w3.org/2001/XMLSchema" xmlns:xs="http://www.w3.org/2001/XMLSchema" xmlns:p="http://schemas.microsoft.com/office/2006/metadata/properties" xmlns:ns2="084a5cd8-1559-4e94-ac72-b94fb9abc19e" targetNamespace="http://schemas.microsoft.com/office/2006/metadata/properties" ma:root="true" ma:fieldsID="6907ed16e1ea7430830aa2dae5b3c1f7" ns2:_="">
     <xsd:import namespace="084a5cd8-1559-4e94-ac72-b94fb9abc19e"/>
@@ -13289,7 +13870,24 @@
 </ct:contentTypeSchema>
 </file>
 
+<file path=customXml/item4.xml><?xml version="1.0" encoding="utf-8"?>
+<?mso-contentType ?>
+<FormTemplates xmlns="http://schemas.microsoft.com/sharepoint/v3/contenttype/forms">
+  <Display>DocumentLibraryForm</Display>
+  <Edit>DocumentLibraryForm</Edit>
+  <New>DocumentLibraryForm</New>
+</FormTemplates>
+</file>
+
 <file path=customXml/itemProps1.xml><?xml version="1.0" encoding="utf-8"?>
+<ds:datastoreItem xmlns:ds="http://schemas.openxmlformats.org/officeDocument/2006/customXml" ds:itemID="{E6E3F1C5-BDFC-4981-9034-4A05696CDD37}">
+  <ds:schemaRefs>
+    <ds:schemaRef ds:uri="http://schemas.openxmlformats.org/officeDocument/2006/bibliography"/>
+  </ds:schemaRefs>
+</ds:datastoreItem>
+</file>
+
+<file path=customXml/itemProps2.xml><?xml version="1.0" encoding="utf-8"?>
 <ds:datastoreItem xmlns:ds="http://schemas.openxmlformats.org/officeDocument/2006/customXml" ds:itemID="{FA90FD41-FA76-42DA-A088-7C01AECDABAA}">
   <ds:schemaRefs>
     <ds:schemaRef ds:uri="http://schemas.microsoft.com/office/2006/metadata/properties"/>
@@ -13299,23 +13897,7 @@
 </ds:datastoreItem>
 </file>
 
-<file path=customXml/itemProps2.xml><?xml version="1.0" encoding="utf-8"?>
-<ds:datastoreItem xmlns:ds="http://schemas.openxmlformats.org/officeDocument/2006/customXml" ds:itemID="{E6E3F1C5-BDFC-4981-9034-4A05696CDD37}">
-  <ds:schemaRefs>
-    <ds:schemaRef ds:uri="http://schemas.openxmlformats.org/officeDocument/2006/bibliography"/>
-  </ds:schemaRefs>
-</ds:datastoreItem>
-</file>
-
 <file path=customXml/itemProps3.xml><?xml version="1.0" encoding="utf-8"?>
-<ds:datastoreItem xmlns:ds="http://schemas.openxmlformats.org/officeDocument/2006/customXml" ds:itemID="{E5ABEBC2-8F24-42D8-B0A5-1D2B76C15645}">
-  <ds:schemaRefs>
-    <ds:schemaRef ds:uri="http://schemas.microsoft.com/sharepoint/v3/contenttype/forms"/>
-  </ds:schemaRefs>
-</ds:datastoreItem>
-</file>
-
-<file path=customXml/itemProps4.xml><?xml version="1.0" encoding="utf-8"?>
 <ds:datastoreItem xmlns:ds="http://schemas.openxmlformats.org/officeDocument/2006/customXml" ds:itemID="{789122CC-B268-41FA-A377-ABDD5160F69C}">
   <ds:schemaRefs>
     <ds:schemaRef ds:uri="http://schemas.microsoft.com/office/2006/metadata/contentType"/>
@@ -13331,4 +13913,12 @@
     <ds:schemaRef ds:uri="http://schemas.microsoft.com/internal/obd"/>
   </ds:schemaRefs>
 </ds:datastoreItem>
+</file>
+
+<file path=customXml/itemProps4.xml><?xml version="1.0" encoding="utf-8"?>
+<ds:datastoreItem xmlns:ds="http://schemas.openxmlformats.org/officeDocument/2006/customXml" ds:itemID="{E5ABEBC2-8F24-42D8-B0A5-1D2B76C15645}">
+  <ds:schemaRefs>
+    <ds:schemaRef ds:uri="http://schemas.microsoft.com/sharepoint/v3/contenttype/forms"/>
+  </ds:schemaRefs>
+</ds:datastoreItem>
 </file>
</xml_diff>